<commit_message>
refactor: swap Deep Learning to Sem 6 (STI-626) and Keamanan Informasi Lanjut to Sem 5 (STI-519)
</commit_message>
<xml_diff>
--- a/KURIKULUM2026_REVISI/024_RINGKAS_EKIVALENSI_UNTUK_AWAM.docx
+++ b/KURIKULUM2026_REVISI/024_RINGKAS_EKIVALENSI_UNTUK_AWAM.docx
@@ -1438,7 +1438,7 @@
                 <w:b w:val="0"/>
                 <w:sz w:val="18"/>
               </w:rPr>
-              <w:t>18</w:t>
+              <w:t>15</w:t>
             </w:r>
           </w:p>
         </w:tc>
@@ -1458,7 +1458,7 @@
                 <w:b w:val="0"/>
                 <w:sz w:val="18"/>
               </w:rPr>
-              <w:t>0</w:t>
+              <w:t>3</w:t>
             </w:r>
           </w:p>
         </w:tc>
@@ -1477,7 +1477,7 @@
                 <w:b w:val="0"/>
                 <w:sz w:val="18"/>
               </w:rPr>
-              <w:t>100.0%</w:t>
+              <w:t>83.3%</w:t>
             </w:r>
           </w:p>
         </w:tc>
@@ -1496,7 +1496,7 @@
                 <w:b w:val="0"/>
                 <w:sz w:val="18"/>
               </w:rPr>
-              <w:t>— (tidak ada, semua diakui)</w:t>
+              <w:t>STI-519 Keamanan Informasi Lanjut</w:t>
             </w:r>
           </w:p>
         </w:tc>
@@ -1557,7 +1557,7 @@
                 <w:b w:val="0"/>
                 <w:sz w:val="18"/>
               </w:rPr>
-              <w:t>10</w:t>
+              <w:t>13</w:t>
             </w:r>
           </w:p>
         </w:tc>
@@ -1577,7 +1577,7 @@
                 <w:b w:val="0"/>
                 <w:sz w:val="18"/>
               </w:rPr>
-              <w:t>3</w:t>
+              <w:t>0</w:t>
             </w:r>
           </w:p>
         </w:tc>
@@ -1596,7 +1596,7 @@
                 <w:b w:val="0"/>
                 <w:sz w:val="18"/>
               </w:rPr>
-              <w:t>76.9%</w:t>
+              <w:t>100.0%</w:t>
             </w:r>
           </w:p>
         </w:tc>
@@ -1615,7 +1615,7 @@
                 <w:b w:val="0"/>
                 <w:sz w:val="18"/>
               </w:rPr>
-              <w:t>STI-626 Keamanan Informasi Lanjut</w:t>
+              <w:t>— (tidak ada, semua diakui)</w:t>
             </w:r>
           </w:p>
         </w:tc>
@@ -2452,7 +2452,7 @@
                 <w:b w:val="0"/>
                 <w:sz w:val="19"/>
               </w:rPr>
-              <w:t>6</w:t>
+              <w:t>5</w:t>
             </w:r>
           </w:p>
         </w:tc>
@@ -2471,7 +2471,7 @@
                 <w:b w:val="0"/>
                 <w:sz w:val="19"/>
               </w:rPr>
-              <w:t>STI-626</w:t>
+              <w:t>STI-519</w:t>
             </w:r>
           </w:p>
         </w:tc>
@@ -11497,7 +11497,7 @@
                 <w:b w:val="0"/>
                 <w:sz w:val="15"/>
               </w:rPr>
-              <w:t>STI-519</w:t>
+              <w:t>STI-626</w:t>
             </w:r>
           </w:p>
         </w:tc>
@@ -19349,7 +19349,7 @@
                 <w:b w:val="0"/>
                 <w:sz w:val="15"/>
               </w:rPr>
-              <w:t>Deep Learning &amp; Neural Networks</w:t>
+              <w:t>Keamanan Informasi Lanjut</w:t>
             </w:r>
           </w:p>
         </w:tc>
@@ -19407,7 +19407,567 @@
                 <w:b w:val="0"/>
                 <w:sz w:val="15"/>
               </w:rPr>
-              <w:t>STI-634</w:t>
+              <w:t>—</w:t>
+            </w:r>
+          </w:p>
+        </w:tc>
+        <w:tc>
+          <w:tcPr>
+            <w:tcW w:type="dxa" w:w="1928"/>
+            <w:shd w:fill="FFC7CE"/>
+          </w:tcPr>
+          <w:p>
+            <w:pPr>
+              <w:spacing w:before="20" w:after="20"/>
+              <w:jc w:val="center"/>
+            </w:pPr>
+            <w:r/>
+            <w:r>
+              <w:rPr>
+                <w:rFonts w:ascii="Calibri" w:hAnsi="Calibri"/>
+                <w:b/>
+                <w:color w:val="9C0006"/>
+                <w:sz w:val="15"/>
+              </w:rPr>
+              <w:t>Wajib ditempuh</w:t>
+            </w:r>
+          </w:p>
+        </w:tc>
+      </w:tr>
+      <w:tr>
+        <w:tc>
+          <w:tcPr>
+            <w:tcW w:type="dxa" w:w="624"/>
+          </w:tcPr>
+          <w:p>
+            <w:pPr>
+              <w:spacing w:before="20" w:after="20"/>
+              <w:jc w:val="center"/>
+            </w:pPr>
+            <w:r/>
+            <w:r>
+              <w:rPr>
+                <w:rFonts w:ascii="Calibri" w:hAnsi="Calibri"/>
+                <w:b w:val="0"/>
+                <w:sz w:val="15"/>
+              </w:rPr>
+              <w:t>5</w:t>
+            </w:r>
+          </w:p>
+        </w:tc>
+        <w:tc>
+          <w:tcPr>
+            <w:tcW w:type="dxa" w:w="1247"/>
+          </w:tcPr>
+          <w:p>
+            <w:pPr>
+              <w:spacing w:before="20" w:after="20"/>
+            </w:pPr>
+            <w:r/>
+            <w:r>
+              <w:rPr>
+                <w:rFonts w:ascii="Calibri" w:hAnsi="Calibri"/>
+                <w:b w:val="0"/>
+                <w:sz w:val="15"/>
+              </w:rPr>
+              <w:t>STI-520</w:t>
+            </w:r>
+          </w:p>
+        </w:tc>
+        <w:tc>
+          <w:tcPr>
+            <w:tcW w:type="dxa" w:w="4195"/>
+          </w:tcPr>
+          <w:p>
+            <w:pPr>
+              <w:spacing w:before="20" w:after="20"/>
+            </w:pPr>
+            <w:r/>
+            <w:r>
+              <w:rPr>
+                <w:rFonts w:ascii="Calibri" w:hAnsi="Calibri"/>
+                <w:b w:val="0"/>
+                <w:sz w:val="15"/>
+              </w:rPr>
+              <w:t>Data Mining &amp; Visualisasi Data</w:t>
+            </w:r>
+          </w:p>
+        </w:tc>
+        <w:tc>
+          <w:tcPr>
+            <w:tcW w:type="dxa" w:w="624"/>
+          </w:tcPr>
+          <w:p>
+            <w:pPr>
+              <w:spacing w:before="20" w:after="20"/>
+              <w:jc w:val="center"/>
+            </w:pPr>
+            <w:r/>
+            <w:r>
+              <w:rPr>
+                <w:rFonts w:ascii="Calibri" w:hAnsi="Calibri"/>
+                <w:b w:val="0"/>
+                <w:sz w:val="15"/>
+              </w:rPr>
+              <w:t>3</w:t>
+            </w:r>
+          </w:p>
+        </w:tc>
+        <w:tc>
+          <w:tcPr>
+            <w:tcW w:type="dxa" w:w="3628"/>
+          </w:tcPr>
+          <w:p>
+            <w:pPr>
+              <w:spacing w:before="20" w:after="20"/>
+            </w:pPr>
+            <w:r/>
+            <w:r>
+              <w:rPr>
+                <w:rFonts w:ascii="Calibri" w:hAnsi="Calibri"/>
+                <w:b w:val="0"/>
+                <w:sz w:val="15"/>
+              </w:rPr>
+              <w:t>Paket wajib</w:t>
+            </w:r>
+          </w:p>
+        </w:tc>
+        <w:tc>
+          <w:tcPr>
+            <w:tcW w:type="dxa" w:w="1928"/>
+          </w:tcPr>
+          <w:p>
+            <w:pPr>
+              <w:spacing w:before="20" w:after="20"/>
+            </w:pPr>
+            <w:r/>
+            <w:r>
+              <w:rPr>
+                <w:rFonts w:ascii="Calibri" w:hAnsi="Calibri"/>
+                <w:b w:val="0"/>
+                <w:sz w:val="15"/>
+              </w:rPr>
+              <w:t>STI-208 + STI-740</w:t>
+            </w:r>
+          </w:p>
+        </w:tc>
+        <w:tc>
+          <w:tcPr>
+            <w:tcW w:type="dxa" w:w="1928"/>
+            <w:shd w:fill="BDD7EE"/>
+          </w:tcPr>
+          <w:p>
+            <w:pPr>
+              <w:spacing w:before="20" w:after="20"/>
+              <w:jc w:val="center"/>
+            </w:pPr>
+            <w:r/>
+            <w:r>
+              <w:rPr>
+                <w:rFonts w:ascii="Calibri" w:hAnsi="Calibri"/>
+                <w:b/>
+                <w:color w:val="1F4E79"/>
+                <w:sz w:val="15"/>
+              </w:rPr>
+              <w:t>Digabung</w:t>
+            </w:r>
+          </w:p>
+        </w:tc>
+      </w:tr>
+      <w:tr>
+        <w:tc>
+          <w:tcPr>
+            <w:tcW w:type="dxa" w:w="624"/>
+          </w:tcPr>
+          <w:p>
+            <w:pPr>
+              <w:spacing w:before="20" w:after="20"/>
+              <w:jc w:val="center"/>
+            </w:pPr>
+            <w:r/>
+            <w:r>
+              <w:rPr>
+                <w:rFonts w:ascii="Calibri" w:hAnsi="Calibri"/>
+                <w:b w:val="0"/>
+                <w:sz w:val="15"/>
+              </w:rPr>
+              <w:t>5</w:t>
+            </w:r>
+          </w:p>
+        </w:tc>
+        <w:tc>
+          <w:tcPr>
+            <w:tcW w:type="dxa" w:w="1247"/>
+          </w:tcPr>
+          <w:p>
+            <w:pPr>
+              <w:spacing w:before="20" w:after="20"/>
+            </w:pPr>
+            <w:r/>
+            <w:r>
+              <w:rPr>
+                <w:rFonts w:ascii="Calibri" w:hAnsi="Calibri"/>
+                <w:b w:val="0"/>
+                <w:sz w:val="15"/>
+              </w:rPr>
+              <w:t>STI-521</w:t>
+            </w:r>
+          </w:p>
+        </w:tc>
+        <w:tc>
+          <w:tcPr>
+            <w:tcW w:type="dxa" w:w="4195"/>
+          </w:tcPr>
+          <w:p>
+            <w:pPr>
+              <w:spacing w:before="20" w:after="20"/>
+            </w:pPr>
+            <w:r/>
+            <w:r>
+              <w:rPr>
+                <w:rFonts w:ascii="Calibri" w:hAnsi="Calibri"/>
+                <w:b w:val="0"/>
+                <w:sz w:val="15"/>
+              </w:rPr>
+              <w:t>Internet of Things (IoT)</w:t>
+            </w:r>
+          </w:p>
+        </w:tc>
+        <w:tc>
+          <w:tcPr>
+            <w:tcW w:type="dxa" w:w="624"/>
+          </w:tcPr>
+          <w:p>
+            <w:pPr>
+              <w:spacing w:before="20" w:after="20"/>
+              <w:jc w:val="center"/>
+            </w:pPr>
+            <w:r/>
+            <w:r>
+              <w:rPr>
+                <w:rFonts w:ascii="Calibri" w:hAnsi="Calibri"/>
+                <w:b w:val="0"/>
+                <w:sz w:val="15"/>
+              </w:rPr>
+              <w:t>3</w:t>
+            </w:r>
+          </w:p>
+        </w:tc>
+        <w:tc>
+          <w:tcPr>
+            <w:tcW w:type="dxa" w:w="3628"/>
+          </w:tcPr>
+          <w:p>
+            <w:pPr>
+              <w:spacing w:before="20" w:after="20"/>
+            </w:pPr>
+            <w:r/>
+            <w:r>
+              <w:rPr>
+                <w:rFonts w:ascii="Calibri" w:hAnsi="Calibri"/>
+                <w:b w:val="0"/>
+                <w:sz w:val="15"/>
+              </w:rPr>
+              <w:t>Paket wajib</w:t>
+            </w:r>
+          </w:p>
+        </w:tc>
+        <w:tc>
+          <w:tcPr>
+            <w:tcW w:type="dxa" w:w="1928"/>
+          </w:tcPr>
+          <w:p>
+            <w:pPr>
+              <w:spacing w:before="20" w:after="20"/>
+            </w:pPr>
+            <w:r/>
+            <w:r>
+              <w:rPr>
+                <w:rFonts w:ascii="Calibri" w:hAnsi="Calibri"/>
+                <w:b w:val="0"/>
+                <w:sz w:val="15"/>
+              </w:rPr>
+              <w:t>STI-526</w:t>
+            </w:r>
+          </w:p>
+        </w:tc>
+        <w:tc>
+          <w:tcPr>
+            <w:tcW w:type="dxa" w:w="1928"/>
+            <w:shd w:fill="C6EFCE"/>
+          </w:tcPr>
+          <w:p>
+            <w:pPr>
+              <w:spacing w:before="20" w:after="20"/>
+              <w:jc w:val="center"/>
+            </w:pPr>
+            <w:r/>
+            <w:r>
+              <w:rPr>
+                <w:rFonts w:ascii="Calibri" w:hAnsi="Calibri"/>
+                <w:b/>
+                <w:color w:val="006100"/>
+                <w:sz w:val="15"/>
+              </w:rPr>
+              <w:t>Diakui penuh</w:t>
+            </w:r>
+          </w:p>
+        </w:tc>
+      </w:tr>
+      <w:tr>
+        <w:tc>
+          <w:tcPr>
+            <w:tcW w:type="dxa" w:w="624"/>
+          </w:tcPr>
+          <w:p>
+            <w:pPr>
+              <w:spacing w:before="20" w:after="20"/>
+              <w:jc w:val="center"/>
+            </w:pPr>
+            <w:r/>
+            <w:r>
+              <w:rPr>
+                <w:rFonts w:ascii="Calibri" w:hAnsi="Calibri"/>
+                <w:b w:val="0"/>
+                <w:sz w:val="15"/>
+              </w:rPr>
+              <w:t>5</w:t>
+            </w:r>
+          </w:p>
+        </w:tc>
+        <w:tc>
+          <w:tcPr>
+            <w:tcW w:type="dxa" w:w="1247"/>
+          </w:tcPr>
+          <w:p>
+            <w:pPr>
+              <w:spacing w:before="20" w:after="20"/>
+            </w:pPr>
+            <w:r/>
+            <w:r>
+              <w:rPr>
+                <w:rFonts w:ascii="Calibri" w:hAnsi="Calibri"/>
+                <w:b w:val="0"/>
+                <w:sz w:val="15"/>
+              </w:rPr>
+              <w:t>STI-522</w:t>
+            </w:r>
+          </w:p>
+        </w:tc>
+        <w:tc>
+          <w:tcPr>
+            <w:tcW w:type="dxa" w:w="4195"/>
+          </w:tcPr>
+          <w:p>
+            <w:pPr>
+              <w:spacing w:before="20" w:after="20"/>
+            </w:pPr>
+            <w:r/>
+            <w:r>
+              <w:rPr>
+                <w:rFonts w:ascii="Calibri" w:hAnsi="Calibri"/>
+                <w:b w:val="0"/>
+                <w:sz w:val="15"/>
+              </w:rPr>
+              <w:t>Pemrograman Aplikasi Mobile</w:t>
+            </w:r>
+          </w:p>
+        </w:tc>
+        <w:tc>
+          <w:tcPr>
+            <w:tcW w:type="dxa" w:w="624"/>
+          </w:tcPr>
+          <w:p>
+            <w:pPr>
+              <w:spacing w:before="20" w:after="20"/>
+              <w:jc w:val="center"/>
+            </w:pPr>
+            <w:r/>
+            <w:r>
+              <w:rPr>
+                <w:rFonts w:ascii="Calibri" w:hAnsi="Calibri"/>
+                <w:b w:val="0"/>
+                <w:sz w:val="15"/>
+              </w:rPr>
+              <w:t>3</w:t>
+            </w:r>
+          </w:p>
+        </w:tc>
+        <w:tc>
+          <w:tcPr>
+            <w:tcW w:type="dxa" w:w="3628"/>
+          </w:tcPr>
+          <w:p>
+            <w:pPr>
+              <w:spacing w:before="20" w:after="20"/>
+            </w:pPr>
+            <w:r/>
+            <w:r>
+              <w:rPr>
+                <w:rFonts w:ascii="Calibri" w:hAnsi="Calibri"/>
+                <w:b w:val="0"/>
+                <w:sz w:val="15"/>
+              </w:rPr>
+              <w:t>Paket wajib</w:t>
+            </w:r>
+          </w:p>
+        </w:tc>
+        <w:tc>
+          <w:tcPr>
+            <w:tcW w:type="dxa" w:w="1928"/>
+          </w:tcPr>
+          <w:p>
+            <w:pPr>
+              <w:spacing w:before="20" w:after="20"/>
+            </w:pPr>
+            <w:r/>
+            <w:r>
+              <w:rPr>
+                <w:rFonts w:ascii="Calibri" w:hAnsi="Calibri"/>
+                <w:b w:val="0"/>
+                <w:sz w:val="15"/>
+              </w:rPr>
+              <w:t>STI-419</w:t>
+            </w:r>
+          </w:p>
+        </w:tc>
+        <w:tc>
+          <w:tcPr>
+            <w:tcW w:type="dxa" w:w="1928"/>
+            <w:shd w:fill="C6EFCE"/>
+          </w:tcPr>
+          <w:p>
+            <w:pPr>
+              <w:spacing w:before="20" w:after="20"/>
+              <w:jc w:val="center"/>
+            </w:pPr>
+            <w:r/>
+            <w:r>
+              <w:rPr>
+                <w:rFonts w:ascii="Calibri" w:hAnsi="Calibri"/>
+                <w:b/>
+                <w:color w:val="006100"/>
+                <w:sz w:val="15"/>
+              </w:rPr>
+              <w:t>Diakui penuh</w:t>
+            </w:r>
+          </w:p>
+        </w:tc>
+      </w:tr>
+      <w:tr>
+        <w:tc>
+          <w:tcPr>
+            <w:tcW w:type="dxa" w:w="624"/>
+          </w:tcPr>
+          <w:p>
+            <w:pPr>
+              <w:spacing w:before="20" w:after="20"/>
+              <w:jc w:val="center"/>
+            </w:pPr>
+            <w:r/>
+            <w:r>
+              <w:rPr>
+                <w:rFonts w:ascii="Calibri" w:hAnsi="Calibri"/>
+                <w:b w:val="0"/>
+                <w:sz w:val="15"/>
+              </w:rPr>
+              <w:t>5</w:t>
+            </w:r>
+          </w:p>
+        </w:tc>
+        <w:tc>
+          <w:tcPr>
+            <w:tcW w:type="dxa" w:w="1247"/>
+          </w:tcPr>
+          <w:p>
+            <w:pPr>
+              <w:spacing w:before="20" w:after="20"/>
+            </w:pPr>
+            <w:r/>
+            <w:r>
+              <w:rPr>
+                <w:rFonts w:ascii="Calibri" w:hAnsi="Calibri"/>
+                <w:b w:val="0"/>
+                <w:sz w:val="15"/>
+              </w:rPr>
+              <w:t>STI-523</w:t>
+            </w:r>
+          </w:p>
+        </w:tc>
+        <w:tc>
+          <w:tcPr>
+            <w:tcW w:type="dxa" w:w="4195"/>
+          </w:tcPr>
+          <w:p>
+            <w:pPr>
+              <w:spacing w:before="20" w:after="20"/>
+            </w:pPr>
+            <w:r/>
+            <w:r>
+              <w:rPr>
+                <w:rFonts w:ascii="Calibri" w:hAnsi="Calibri"/>
+                <w:b w:val="0"/>
+                <w:sz w:val="15"/>
+              </w:rPr>
+              <w:t>Manajemen Proyek TI</w:t>
+            </w:r>
+          </w:p>
+        </w:tc>
+        <w:tc>
+          <w:tcPr>
+            <w:tcW w:type="dxa" w:w="624"/>
+          </w:tcPr>
+          <w:p>
+            <w:pPr>
+              <w:spacing w:before="20" w:after="20"/>
+              <w:jc w:val="center"/>
+            </w:pPr>
+            <w:r/>
+            <w:r>
+              <w:rPr>
+                <w:rFonts w:ascii="Calibri" w:hAnsi="Calibri"/>
+                <w:b w:val="0"/>
+                <w:sz w:val="15"/>
+              </w:rPr>
+              <w:t>3</w:t>
+            </w:r>
+          </w:p>
+        </w:tc>
+        <w:tc>
+          <w:tcPr>
+            <w:tcW w:type="dxa" w:w="3628"/>
+          </w:tcPr>
+          <w:p>
+            <w:pPr>
+              <w:spacing w:before="20" w:after="20"/>
+            </w:pPr>
+            <w:r/>
+            <w:r>
+              <w:rPr>
+                <w:rFonts w:ascii="Calibri" w:hAnsi="Calibri"/>
+                <w:b w:val="0"/>
+                <w:sz w:val="15"/>
+              </w:rPr>
+              <w:t>Paket wajib</w:t>
+            </w:r>
+          </w:p>
+        </w:tc>
+        <w:tc>
+          <w:tcPr>
+            <w:tcW w:type="dxa" w:w="1928"/>
+          </w:tcPr>
+          <w:p>
+            <w:pPr>
+              <w:spacing w:before="20" w:after="20"/>
+            </w:pPr>
+            <w:r/>
+            <w:r>
+              <w:rPr>
+                <w:rFonts w:ascii="Calibri" w:hAnsi="Calibri"/>
+                <w:b w:val="0"/>
+                <w:sz w:val="15"/>
+              </w:rPr>
+              <w:t>STI-421</w:t>
             </w:r>
           </w:p>
         </w:tc>
@@ -19451,7 +20011,7 @@
                 <w:b w:val="0"/>
                 <w:sz w:val="15"/>
               </w:rPr>
-              <w:t>5</w:t>
+              <w:t>6</w:t>
             </w:r>
           </w:p>
         </w:tc>
@@ -19470,7 +20030,7 @@
                 <w:b w:val="0"/>
                 <w:sz w:val="15"/>
               </w:rPr>
-              <w:t>STI-520</w:t>
+              <w:t>FST-611</w:t>
             </w:r>
           </w:p>
         </w:tc>
@@ -19489,7 +20049,7 @@
                 <w:b w:val="0"/>
                 <w:sz w:val="15"/>
               </w:rPr>
-              <w:t>Data Mining &amp; Visualisasi Data</w:t>
+              <w:t>Metodologi Penelitian</w:t>
             </w:r>
           </w:p>
         </w:tc>
@@ -19509,7 +20069,7 @@
                 <w:b w:val="0"/>
                 <w:sz w:val="15"/>
               </w:rPr>
-              <w:t>3</w:t>
+              <w:t>2</w:t>
             </w:r>
           </w:p>
         </w:tc>
@@ -19547,14 +20107,14 @@
                 <w:b w:val="0"/>
                 <w:sz w:val="15"/>
               </w:rPr>
-              <w:t>STI-208 + STI-740</w:t>
+              <w:t>MFT-002</w:t>
             </w:r>
           </w:p>
         </w:tc>
         <w:tc>
           <w:tcPr>
             <w:tcW w:type="dxa" w:w="1928"/>
-            <w:shd w:fill="BDD7EE"/>
+            <w:shd w:fill="C6EFCE"/>
           </w:tcPr>
           <w:p>
             <w:pPr>
@@ -19566,10 +20126,10 @@
               <w:rPr>
                 <w:rFonts w:ascii="Calibri" w:hAnsi="Calibri"/>
                 <w:b/>
-                <w:color w:val="1F4E79"/>
-                <w:sz w:val="15"/>
-              </w:rPr>
-              <w:t>Digabung</w:t>
+                <w:color w:val="006100"/>
+                <w:sz w:val="15"/>
+              </w:rPr>
+              <w:t>Diakui penuh</w:t>
             </w:r>
           </w:p>
         </w:tc>
@@ -19591,7 +20151,7 @@
                 <w:b w:val="0"/>
                 <w:sz w:val="15"/>
               </w:rPr>
-              <w:t>5</w:t>
+              <w:t>6</w:t>
             </w:r>
           </w:p>
         </w:tc>
@@ -19610,7 +20170,7 @@
                 <w:b w:val="0"/>
                 <w:sz w:val="15"/>
               </w:rPr>
-              <w:t>STI-521</w:t>
+              <w:t>STA-02</w:t>
             </w:r>
           </w:p>
         </w:tc>
@@ -19629,7 +20189,7 @@
                 <w:b w:val="0"/>
                 <w:sz w:val="15"/>
               </w:rPr>
-              <w:t>Internet of Things (IoT)</w:t>
+              <w:t>Computational Methods and Numerics</w:t>
             </w:r>
           </w:p>
         </w:tc>
@@ -19668,6 +20228,846 @@
                 <w:b w:val="0"/>
                 <w:sz w:val="15"/>
               </w:rPr>
+              <w:t>P1 Integrated Smart Systems</w:t>
+            </w:r>
+          </w:p>
+        </w:tc>
+        <w:tc>
+          <w:tcPr>
+            <w:tcW w:type="dxa" w:w="1928"/>
+          </w:tcPr>
+          <w:p>
+            <w:pPr>
+              <w:spacing w:before="20" w:after="20"/>
+            </w:pPr>
+            <w:r/>
+            <w:r>
+              <w:rPr>
+                <w:rFonts w:ascii="Calibri" w:hAnsi="Calibri"/>
+                <w:b w:val="0"/>
+                <w:sz w:val="15"/>
+              </w:rPr>
+              <w:t>STI-317</w:t>
+            </w:r>
+          </w:p>
+        </w:tc>
+        <w:tc>
+          <w:tcPr>
+            <w:tcW w:type="dxa" w:w="1928"/>
+            <w:shd w:fill="FFEB9C"/>
+          </w:tcPr>
+          <w:p>
+            <w:pPr>
+              <w:spacing w:before="20" w:after="20"/>
+              <w:jc w:val="center"/>
+            </w:pPr>
+            <w:r/>
+            <w:r>
+              <w:rPr>
+                <w:rFonts w:ascii="Calibri" w:hAnsi="Calibri"/>
+                <w:b/>
+                <w:color w:val="9C5700"/>
+                <w:sz w:val="15"/>
+              </w:rPr>
+              <w:t>Diakui bersyarat</w:t>
+            </w:r>
+          </w:p>
+        </w:tc>
+      </w:tr>
+      <w:tr>
+        <w:tc>
+          <w:tcPr>
+            <w:tcW w:type="dxa" w:w="624"/>
+          </w:tcPr>
+          <w:p>
+            <w:pPr>
+              <w:spacing w:before="20" w:after="20"/>
+              <w:jc w:val="center"/>
+            </w:pPr>
+            <w:r/>
+            <w:r>
+              <w:rPr>
+                <w:rFonts w:ascii="Calibri" w:hAnsi="Calibri"/>
+                <w:b w:val="0"/>
+                <w:sz w:val="15"/>
+              </w:rPr>
+              <w:t>6</w:t>
+            </w:r>
+          </w:p>
+        </w:tc>
+        <w:tc>
+          <w:tcPr>
+            <w:tcW w:type="dxa" w:w="1247"/>
+          </w:tcPr>
+          <w:p>
+            <w:pPr>
+              <w:spacing w:before="20" w:after="20"/>
+            </w:pPr>
+            <w:r/>
+            <w:r>
+              <w:rPr>
+                <w:rFonts w:ascii="Calibri" w:hAnsi="Calibri"/>
+                <w:b w:val="0"/>
+                <w:sz w:val="15"/>
+              </w:rPr>
+              <w:t>STA-03</w:t>
+            </w:r>
+          </w:p>
+        </w:tc>
+        <w:tc>
+          <w:tcPr>
+            <w:tcW w:type="dxa" w:w="4195"/>
+          </w:tcPr>
+          <w:p>
+            <w:pPr>
+              <w:spacing w:before="20" w:after="20"/>
+            </w:pPr>
+            <w:r/>
+            <w:r>
+              <w:rPr>
+                <w:rFonts w:ascii="Calibri" w:hAnsi="Calibri"/>
+                <w:b w:val="0"/>
+                <w:sz w:val="15"/>
+              </w:rPr>
+              <w:t>Intelligent Agent Systems</w:t>
+            </w:r>
+          </w:p>
+        </w:tc>
+        <w:tc>
+          <w:tcPr>
+            <w:tcW w:type="dxa" w:w="624"/>
+          </w:tcPr>
+          <w:p>
+            <w:pPr>
+              <w:spacing w:before="20" w:after="20"/>
+              <w:jc w:val="center"/>
+            </w:pPr>
+            <w:r/>
+            <w:r>
+              <w:rPr>
+                <w:rFonts w:ascii="Calibri" w:hAnsi="Calibri"/>
+                <w:b w:val="0"/>
+                <w:sz w:val="15"/>
+              </w:rPr>
+              <w:t>3</w:t>
+            </w:r>
+          </w:p>
+        </w:tc>
+        <w:tc>
+          <w:tcPr>
+            <w:tcW w:type="dxa" w:w="3628"/>
+          </w:tcPr>
+          <w:p>
+            <w:pPr>
+              <w:spacing w:before="20" w:after="20"/>
+            </w:pPr>
+            <w:r/>
+            <w:r>
+              <w:rPr>
+                <w:rFonts w:ascii="Calibri" w:hAnsi="Calibri"/>
+                <w:b w:val="0"/>
+                <w:sz w:val="15"/>
+              </w:rPr>
+              <w:t>P1 Integrated Smart Systems</w:t>
+            </w:r>
+          </w:p>
+        </w:tc>
+        <w:tc>
+          <w:tcPr>
+            <w:tcW w:type="dxa" w:w="1928"/>
+          </w:tcPr>
+          <w:p>
+            <w:pPr>
+              <w:spacing w:before="20" w:after="20"/>
+            </w:pPr>
+            <w:r/>
+            <w:r>
+              <w:rPr>
+                <w:rFonts w:ascii="Calibri" w:hAnsi="Calibri"/>
+                <w:b w:val="0"/>
+                <w:sz w:val="15"/>
+              </w:rPr>
+              <w:t>—</w:t>
+            </w:r>
+          </w:p>
+        </w:tc>
+        <w:tc>
+          <w:tcPr>
+            <w:tcW w:type="dxa" w:w="1928"/>
+            <w:shd w:fill="FFC7CE"/>
+          </w:tcPr>
+          <w:p>
+            <w:pPr>
+              <w:spacing w:before="20" w:after="20"/>
+              <w:jc w:val="center"/>
+            </w:pPr>
+            <w:r/>
+            <w:r>
+              <w:rPr>
+                <w:rFonts w:ascii="Calibri" w:hAnsi="Calibri"/>
+                <w:b/>
+                <w:color w:val="9C0006"/>
+                <w:sz w:val="15"/>
+              </w:rPr>
+              <w:t>Wajib ditempuh</w:t>
+            </w:r>
+          </w:p>
+        </w:tc>
+      </w:tr>
+      <w:tr>
+        <w:tc>
+          <w:tcPr>
+            <w:tcW w:type="dxa" w:w="624"/>
+          </w:tcPr>
+          <w:p>
+            <w:pPr>
+              <w:spacing w:before="20" w:after="20"/>
+              <w:jc w:val="center"/>
+            </w:pPr>
+            <w:r/>
+            <w:r>
+              <w:rPr>
+                <w:rFonts w:ascii="Calibri" w:hAnsi="Calibri"/>
+                <w:b w:val="0"/>
+                <w:sz w:val="15"/>
+              </w:rPr>
+              <w:t>6</w:t>
+            </w:r>
+          </w:p>
+        </w:tc>
+        <w:tc>
+          <w:tcPr>
+            <w:tcW w:type="dxa" w:w="1247"/>
+          </w:tcPr>
+          <w:p>
+            <w:pPr>
+              <w:spacing w:before="20" w:after="20"/>
+            </w:pPr>
+            <w:r/>
+            <w:r>
+              <w:rPr>
+                <w:rFonts w:ascii="Calibri" w:hAnsi="Calibri"/>
+                <w:b w:val="0"/>
+                <w:sz w:val="15"/>
+              </w:rPr>
+              <w:t>STB-02</w:t>
+            </w:r>
+          </w:p>
+        </w:tc>
+        <w:tc>
+          <w:tcPr>
+            <w:tcW w:type="dxa" w:w="4195"/>
+          </w:tcPr>
+          <w:p>
+            <w:pPr>
+              <w:spacing w:before="20" w:after="20"/>
+            </w:pPr>
+            <w:r/>
+            <w:r>
+              <w:rPr>
+                <w:rFonts w:ascii="Calibri" w:hAnsi="Calibri"/>
+                <w:b w:val="0"/>
+                <w:sz w:val="15"/>
+              </w:rPr>
+              <w:t>Cloud Architecture &amp; DevOps</w:t>
+            </w:r>
+          </w:p>
+        </w:tc>
+        <w:tc>
+          <w:tcPr>
+            <w:tcW w:type="dxa" w:w="624"/>
+          </w:tcPr>
+          <w:p>
+            <w:pPr>
+              <w:spacing w:before="20" w:after="20"/>
+              <w:jc w:val="center"/>
+            </w:pPr>
+            <w:r/>
+            <w:r>
+              <w:rPr>
+                <w:rFonts w:ascii="Calibri" w:hAnsi="Calibri"/>
+                <w:b w:val="0"/>
+                <w:sz w:val="15"/>
+              </w:rPr>
+              <w:t>3</w:t>
+            </w:r>
+          </w:p>
+        </w:tc>
+        <w:tc>
+          <w:tcPr>
+            <w:tcW w:type="dxa" w:w="3628"/>
+          </w:tcPr>
+          <w:p>
+            <w:pPr>
+              <w:spacing w:before="20" w:after="20"/>
+            </w:pPr>
+            <w:r/>
+            <w:r>
+              <w:rPr>
+                <w:rFonts w:ascii="Calibri" w:hAnsi="Calibri"/>
+                <w:b w:val="0"/>
+                <w:sz w:val="15"/>
+              </w:rPr>
+              <w:t>P2 Cloud Infrastructure &amp; Cybersecurity</w:t>
+            </w:r>
+          </w:p>
+        </w:tc>
+        <w:tc>
+          <w:tcPr>
+            <w:tcW w:type="dxa" w:w="1928"/>
+          </w:tcPr>
+          <w:p>
+            <w:pPr>
+              <w:spacing w:before="20" w:after="20"/>
+            </w:pPr>
+            <w:r/>
+            <w:r>
+              <w:rPr>
+                <w:rFonts w:ascii="Calibri" w:hAnsi="Calibri"/>
+                <w:b w:val="0"/>
+                <w:sz w:val="15"/>
+              </w:rPr>
+              <w:t>—</w:t>
+            </w:r>
+          </w:p>
+        </w:tc>
+        <w:tc>
+          <w:tcPr>
+            <w:tcW w:type="dxa" w:w="1928"/>
+            <w:shd w:fill="FFC7CE"/>
+          </w:tcPr>
+          <w:p>
+            <w:pPr>
+              <w:spacing w:before="20" w:after="20"/>
+              <w:jc w:val="center"/>
+            </w:pPr>
+            <w:r/>
+            <w:r>
+              <w:rPr>
+                <w:rFonts w:ascii="Calibri" w:hAnsi="Calibri"/>
+                <w:b/>
+                <w:color w:val="9C0006"/>
+                <w:sz w:val="15"/>
+              </w:rPr>
+              <w:t>Wajib ditempuh</w:t>
+            </w:r>
+          </w:p>
+        </w:tc>
+      </w:tr>
+      <w:tr>
+        <w:tc>
+          <w:tcPr>
+            <w:tcW w:type="dxa" w:w="624"/>
+          </w:tcPr>
+          <w:p>
+            <w:pPr>
+              <w:spacing w:before="20" w:after="20"/>
+              <w:jc w:val="center"/>
+            </w:pPr>
+            <w:r/>
+            <w:r>
+              <w:rPr>
+                <w:rFonts w:ascii="Calibri" w:hAnsi="Calibri"/>
+                <w:b w:val="0"/>
+                <w:sz w:val="15"/>
+              </w:rPr>
+              <w:t>6</w:t>
+            </w:r>
+          </w:p>
+        </w:tc>
+        <w:tc>
+          <w:tcPr>
+            <w:tcW w:type="dxa" w:w="1247"/>
+          </w:tcPr>
+          <w:p>
+            <w:pPr>
+              <w:spacing w:before="20" w:after="20"/>
+            </w:pPr>
+            <w:r/>
+            <w:r>
+              <w:rPr>
+                <w:rFonts w:ascii="Calibri" w:hAnsi="Calibri"/>
+                <w:b w:val="0"/>
+                <w:sz w:val="15"/>
+              </w:rPr>
+              <w:t>STB-03</w:t>
+            </w:r>
+          </w:p>
+        </w:tc>
+        <w:tc>
+          <w:tcPr>
+            <w:tcW w:type="dxa" w:w="4195"/>
+          </w:tcPr>
+          <w:p>
+            <w:pPr>
+              <w:spacing w:before="20" w:after="20"/>
+            </w:pPr>
+            <w:r/>
+            <w:r>
+              <w:rPr>
+                <w:rFonts w:ascii="Calibri" w:hAnsi="Calibri"/>
+                <w:b w:val="0"/>
+                <w:sz w:val="15"/>
+              </w:rPr>
+              <w:t>Cybersecurity Risk Management</w:t>
+            </w:r>
+          </w:p>
+        </w:tc>
+        <w:tc>
+          <w:tcPr>
+            <w:tcW w:type="dxa" w:w="624"/>
+          </w:tcPr>
+          <w:p>
+            <w:pPr>
+              <w:spacing w:before="20" w:after="20"/>
+              <w:jc w:val="center"/>
+            </w:pPr>
+            <w:r/>
+            <w:r>
+              <w:rPr>
+                <w:rFonts w:ascii="Calibri" w:hAnsi="Calibri"/>
+                <w:b w:val="0"/>
+                <w:sz w:val="15"/>
+              </w:rPr>
+              <w:t>3</w:t>
+            </w:r>
+          </w:p>
+        </w:tc>
+        <w:tc>
+          <w:tcPr>
+            <w:tcW w:type="dxa" w:w="3628"/>
+          </w:tcPr>
+          <w:p>
+            <w:pPr>
+              <w:spacing w:before="20" w:after="20"/>
+            </w:pPr>
+            <w:r/>
+            <w:r>
+              <w:rPr>
+                <w:rFonts w:ascii="Calibri" w:hAnsi="Calibri"/>
+                <w:b w:val="0"/>
+                <w:sz w:val="15"/>
+              </w:rPr>
+              <w:t>P2 Cloud Infrastructure &amp; Cybersecurity</w:t>
+            </w:r>
+          </w:p>
+        </w:tc>
+        <w:tc>
+          <w:tcPr>
+            <w:tcW w:type="dxa" w:w="1928"/>
+          </w:tcPr>
+          <w:p>
+            <w:pPr>
+              <w:spacing w:before="20" w:after="20"/>
+            </w:pPr>
+            <w:r/>
+            <w:r>
+              <w:rPr>
+                <w:rFonts w:ascii="Calibri" w:hAnsi="Calibri"/>
+                <w:b w:val="0"/>
+                <w:sz w:val="15"/>
+              </w:rPr>
+              <w:t>—</w:t>
+            </w:r>
+          </w:p>
+        </w:tc>
+        <w:tc>
+          <w:tcPr>
+            <w:tcW w:type="dxa" w:w="1928"/>
+            <w:shd w:fill="FFC7CE"/>
+          </w:tcPr>
+          <w:p>
+            <w:pPr>
+              <w:spacing w:before="20" w:after="20"/>
+              <w:jc w:val="center"/>
+            </w:pPr>
+            <w:r/>
+            <w:r>
+              <w:rPr>
+                <w:rFonts w:ascii="Calibri" w:hAnsi="Calibri"/>
+                <w:b/>
+                <w:color w:val="9C0006"/>
+                <w:sz w:val="15"/>
+              </w:rPr>
+              <w:t>Wajib ditempuh</w:t>
+            </w:r>
+          </w:p>
+        </w:tc>
+      </w:tr>
+      <w:tr>
+        <w:tc>
+          <w:tcPr>
+            <w:tcW w:type="dxa" w:w="624"/>
+          </w:tcPr>
+          <w:p>
+            <w:pPr>
+              <w:spacing w:before="20" w:after="20"/>
+              <w:jc w:val="center"/>
+            </w:pPr>
+            <w:r/>
+            <w:r>
+              <w:rPr>
+                <w:rFonts w:ascii="Calibri" w:hAnsi="Calibri"/>
+                <w:b w:val="0"/>
+                <w:sz w:val="15"/>
+              </w:rPr>
+              <w:t>6</w:t>
+            </w:r>
+          </w:p>
+        </w:tc>
+        <w:tc>
+          <w:tcPr>
+            <w:tcW w:type="dxa" w:w="1247"/>
+          </w:tcPr>
+          <w:p>
+            <w:pPr>
+              <w:spacing w:before="20" w:after="20"/>
+            </w:pPr>
+            <w:r/>
+            <w:r>
+              <w:rPr>
+                <w:rFonts w:ascii="Calibri" w:hAnsi="Calibri"/>
+                <w:b w:val="0"/>
+                <w:sz w:val="15"/>
+              </w:rPr>
+              <w:t>STC-02</w:t>
+            </w:r>
+          </w:p>
+        </w:tc>
+        <w:tc>
+          <w:tcPr>
+            <w:tcW w:type="dxa" w:w="4195"/>
+          </w:tcPr>
+          <w:p>
+            <w:pPr>
+              <w:spacing w:before="20" w:after="20"/>
+            </w:pPr>
+            <w:r/>
+            <w:r>
+              <w:rPr>
+                <w:rFonts w:ascii="Calibri" w:hAnsi="Calibri"/>
+                <w:b w:val="0"/>
+                <w:sz w:val="15"/>
+              </w:rPr>
+              <w:t>Rekayasa &amp; Otomasi Proses Bisnis (BPA)</w:t>
+            </w:r>
+          </w:p>
+        </w:tc>
+        <w:tc>
+          <w:tcPr>
+            <w:tcW w:type="dxa" w:w="624"/>
+          </w:tcPr>
+          <w:p>
+            <w:pPr>
+              <w:spacing w:before="20" w:after="20"/>
+              <w:jc w:val="center"/>
+            </w:pPr>
+            <w:r/>
+            <w:r>
+              <w:rPr>
+                <w:rFonts w:ascii="Calibri" w:hAnsi="Calibri"/>
+                <w:b w:val="0"/>
+                <w:sz w:val="15"/>
+              </w:rPr>
+              <w:t>3</w:t>
+            </w:r>
+          </w:p>
+        </w:tc>
+        <w:tc>
+          <w:tcPr>
+            <w:tcW w:type="dxa" w:w="3628"/>
+          </w:tcPr>
+          <w:p>
+            <w:pPr>
+              <w:spacing w:before="20" w:after="20"/>
+            </w:pPr>
+            <w:r/>
+            <w:r>
+              <w:rPr>
+                <w:rFonts w:ascii="Calibri" w:hAnsi="Calibri"/>
+                <w:b w:val="0"/>
+                <w:sz w:val="15"/>
+              </w:rPr>
+              <w:t>P3 Digital Platform Engineering</w:t>
+            </w:r>
+          </w:p>
+        </w:tc>
+        <w:tc>
+          <w:tcPr>
+            <w:tcW w:type="dxa" w:w="1928"/>
+          </w:tcPr>
+          <w:p>
+            <w:pPr>
+              <w:spacing w:before="20" w:after="20"/>
+            </w:pPr>
+            <w:r/>
+            <w:r>
+              <w:rPr>
+                <w:rFonts w:ascii="Calibri" w:hAnsi="Calibri"/>
+                <w:b w:val="0"/>
+                <w:sz w:val="15"/>
+              </w:rPr>
+              <w:t>—</w:t>
+            </w:r>
+          </w:p>
+        </w:tc>
+        <w:tc>
+          <w:tcPr>
+            <w:tcW w:type="dxa" w:w="1928"/>
+            <w:shd w:fill="FFC7CE"/>
+          </w:tcPr>
+          <w:p>
+            <w:pPr>
+              <w:spacing w:before="20" w:after="20"/>
+              <w:jc w:val="center"/>
+            </w:pPr>
+            <w:r/>
+            <w:r>
+              <w:rPr>
+                <w:rFonts w:ascii="Calibri" w:hAnsi="Calibri"/>
+                <w:b/>
+                <w:color w:val="9C0006"/>
+                <w:sz w:val="15"/>
+              </w:rPr>
+              <w:t>Wajib ditempuh</w:t>
+            </w:r>
+          </w:p>
+        </w:tc>
+      </w:tr>
+      <w:tr>
+        <w:tc>
+          <w:tcPr>
+            <w:tcW w:type="dxa" w:w="624"/>
+          </w:tcPr>
+          <w:p>
+            <w:pPr>
+              <w:spacing w:before="20" w:after="20"/>
+              <w:jc w:val="center"/>
+            </w:pPr>
+            <w:r/>
+            <w:r>
+              <w:rPr>
+                <w:rFonts w:ascii="Calibri" w:hAnsi="Calibri"/>
+                <w:b w:val="0"/>
+                <w:sz w:val="15"/>
+              </w:rPr>
+              <w:t>6</w:t>
+            </w:r>
+          </w:p>
+        </w:tc>
+        <w:tc>
+          <w:tcPr>
+            <w:tcW w:type="dxa" w:w="1247"/>
+          </w:tcPr>
+          <w:p>
+            <w:pPr>
+              <w:spacing w:before="20" w:after="20"/>
+            </w:pPr>
+            <w:r/>
+            <w:r>
+              <w:rPr>
+                <w:rFonts w:ascii="Calibri" w:hAnsi="Calibri"/>
+                <w:b w:val="0"/>
+                <w:sz w:val="15"/>
+              </w:rPr>
+              <w:t>STC-03</w:t>
+            </w:r>
+          </w:p>
+        </w:tc>
+        <w:tc>
+          <w:tcPr>
+            <w:tcW w:type="dxa" w:w="4195"/>
+          </w:tcPr>
+          <w:p>
+            <w:pPr>
+              <w:spacing w:before="20" w:after="20"/>
+            </w:pPr>
+            <w:r/>
+            <w:r>
+              <w:rPr>
+                <w:rFonts w:ascii="Calibri" w:hAnsi="Calibri"/>
+                <w:b w:val="0"/>
+                <w:sz w:val="15"/>
+              </w:rPr>
+              <w:t>Rekayasa Aplikasi Industri Vertikal (FinTech &amp; EdTech)</w:t>
+            </w:r>
+          </w:p>
+        </w:tc>
+        <w:tc>
+          <w:tcPr>
+            <w:tcW w:type="dxa" w:w="624"/>
+          </w:tcPr>
+          <w:p>
+            <w:pPr>
+              <w:spacing w:before="20" w:after="20"/>
+              <w:jc w:val="center"/>
+            </w:pPr>
+            <w:r/>
+            <w:r>
+              <w:rPr>
+                <w:rFonts w:ascii="Calibri" w:hAnsi="Calibri"/>
+                <w:b w:val="0"/>
+                <w:sz w:val="15"/>
+              </w:rPr>
+              <w:t>3</w:t>
+            </w:r>
+          </w:p>
+        </w:tc>
+        <w:tc>
+          <w:tcPr>
+            <w:tcW w:type="dxa" w:w="3628"/>
+          </w:tcPr>
+          <w:p>
+            <w:pPr>
+              <w:spacing w:before="20" w:after="20"/>
+            </w:pPr>
+            <w:r/>
+            <w:r>
+              <w:rPr>
+                <w:rFonts w:ascii="Calibri" w:hAnsi="Calibri"/>
+                <w:b w:val="0"/>
+                <w:sz w:val="15"/>
+              </w:rPr>
+              <w:t>P3 Digital Platform Engineering</w:t>
+            </w:r>
+          </w:p>
+        </w:tc>
+        <w:tc>
+          <w:tcPr>
+            <w:tcW w:type="dxa" w:w="1928"/>
+          </w:tcPr>
+          <w:p>
+            <w:pPr>
+              <w:spacing w:before="20" w:after="20"/>
+            </w:pPr>
+            <w:r/>
+            <w:r>
+              <w:rPr>
+                <w:rFonts w:ascii="Calibri" w:hAnsi="Calibri"/>
+                <w:b w:val="0"/>
+                <w:sz w:val="15"/>
+              </w:rPr>
+              <w:t>—</w:t>
+            </w:r>
+          </w:p>
+        </w:tc>
+        <w:tc>
+          <w:tcPr>
+            <w:tcW w:type="dxa" w:w="1928"/>
+            <w:shd w:fill="FFC7CE"/>
+          </w:tcPr>
+          <w:p>
+            <w:pPr>
+              <w:spacing w:before="20" w:after="20"/>
+              <w:jc w:val="center"/>
+            </w:pPr>
+            <w:r/>
+            <w:r>
+              <w:rPr>
+                <w:rFonts w:ascii="Calibri" w:hAnsi="Calibri"/>
+                <w:b/>
+                <w:color w:val="9C0006"/>
+                <w:sz w:val="15"/>
+              </w:rPr>
+              <w:t>Wajib ditempuh</w:t>
+            </w:r>
+          </w:p>
+        </w:tc>
+      </w:tr>
+      <w:tr>
+        <w:tc>
+          <w:tcPr>
+            <w:tcW w:type="dxa" w:w="624"/>
+          </w:tcPr>
+          <w:p>
+            <w:pPr>
+              <w:spacing w:before="20" w:after="20"/>
+              <w:jc w:val="center"/>
+            </w:pPr>
+            <w:r/>
+            <w:r>
+              <w:rPr>
+                <w:rFonts w:ascii="Calibri" w:hAnsi="Calibri"/>
+                <w:b w:val="0"/>
+                <w:sz w:val="15"/>
+              </w:rPr>
+              <w:t>6</w:t>
+            </w:r>
+          </w:p>
+        </w:tc>
+        <w:tc>
+          <w:tcPr>
+            <w:tcW w:type="dxa" w:w="1247"/>
+          </w:tcPr>
+          <w:p>
+            <w:pPr>
+              <w:spacing w:before="20" w:after="20"/>
+            </w:pPr>
+            <w:r/>
+            <w:r>
+              <w:rPr>
+                <w:rFonts w:ascii="Calibri" w:hAnsi="Calibri"/>
+                <w:b w:val="0"/>
+                <w:sz w:val="15"/>
+              </w:rPr>
+              <w:t>STI-624</w:t>
+            </w:r>
+          </w:p>
+        </w:tc>
+        <w:tc>
+          <w:tcPr>
+            <w:tcW w:type="dxa" w:w="4195"/>
+          </w:tcPr>
+          <w:p>
+            <w:pPr>
+              <w:spacing w:before="20" w:after="20"/>
+            </w:pPr>
+            <w:r/>
+            <w:r>
+              <w:rPr>
+                <w:rFonts w:ascii="Calibri" w:hAnsi="Calibri"/>
+                <w:b w:val="0"/>
+                <w:sz w:val="15"/>
+              </w:rPr>
+              <w:t>Integrasi Layanan Cerdas Berbasis AI</w:t>
+            </w:r>
+          </w:p>
+        </w:tc>
+        <w:tc>
+          <w:tcPr>
+            <w:tcW w:type="dxa" w:w="624"/>
+          </w:tcPr>
+          <w:p>
+            <w:pPr>
+              <w:spacing w:before="20" w:after="20"/>
+              <w:jc w:val="center"/>
+            </w:pPr>
+            <w:r/>
+            <w:r>
+              <w:rPr>
+                <w:rFonts w:ascii="Calibri" w:hAnsi="Calibri"/>
+                <w:b w:val="0"/>
+                <w:sz w:val="15"/>
+              </w:rPr>
+              <w:t>3</w:t>
+            </w:r>
+          </w:p>
+        </w:tc>
+        <w:tc>
+          <w:tcPr>
+            <w:tcW w:type="dxa" w:w="3628"/>
+          </w:tcPr>
+          <w:p>
+            <w:pPr>
+              <w:spacing w:before="20" w:after="20"/>
+            </w:pPr>
+            <w:r/>
+            <w:r>
+              <w:rPr>
+                <w:rFonts w:ascii="Calibri" w:hAnsi="Calibri"/>
+                <w:b w:val="0"/>
+                <w:sz w:val="15"/>
+              </w:rPr>
               <w:t>Paket wajib</w:t>
             </w:r>
           </w:p>
@@ -19687,7 +21087,147 @@
                 <w:b w:val="0"/>
                 <w:sz w:val="15"/>
               </w:rPr>
-              <w:t>STI-526</w:t>
+              <w:t>STI-741</w:t>
+            </w:r>
+          </w:p>
+        </w:tc>
+        <w:tc>
+          <w:tcPr>
+            <w:tcW w:type="dxa" w:w="1928"/>
+            <w:shd w:fill="FFEB9C"/>
+          </w:tcPr>
+          <w:p>
+            <w:pPr>
+              <w:spacing w:before="20" w:after="20"/>
+              <w:jc w:val="center"/>
+            </w:pPr>
+            <w:r/>
+            <w:r>
+              <w:rPr>
+                <w:rFonts w:ascii="Calibri" w:hAnsi="Calibri"/>
+                <w:b/>
+                <w:color w:val="9C5700"/>
+                <w:sz w:val="15"/>
+              </w:rPr>
+              <w:t>Diakui bersyarat</w:t>
+            </w:r>
+          </w:p>
+        </w:tc>
+      </w:tr>
+      <w:tr>
+        <w:tc>
+          <w:tcPr>
+            <w:tcW w:type="dxa" w:w="624"/>
+          </w:tcPr>
+          <w:p>
+            <w:pPr>
+              <w:spacing w:before="20" w:after="20"/>
+              <w:jc w:val="center"/>
+            </w:pPr>
+            <w:r/>
+            <w:r>
+              <w:rPr>
+                <w:rFonts w:ascii="Calibri" w:hAnsi="Calibri"/>
+                <w:b w:val="0"/>
+                <w:sz w:val="15"/>
+              </w:rPr>
+              <w:t>6</w:t>
+            </w:r>
+          </w:p>
+        </w:tc>
+        <w:tc>
+          <w:tcPr>
+            <w:tcW w:type="dxa" w:w="1247"/>
+          </w:tcPr>
+          <w:p>
+            <w:pPr>
+              <w:spacing w:before="20" w:after="20"/>
+            </w:pPr>
+            <w:r/>
+            <w:r>
+              <w:rPr>
+                <w:rFonts w:ascii="Calibri" w:hAnsi="Calibri"/>
+                <w:b w:val="0"/>
+                <w:sz w:val="15"/>
+              </w:rPr>
+              <w:t>STI-625</w:t>
+            </w:r>
+          </w:p>
+        </w:tc>
+        <w:tc>
+          <w:tcPr>
+            <w:tcW w:type="dxa" w:w="4195"/>
+          </w:tcPr>
+          <w:p>
+            <w:pPr>
+              <w:spacing w:before="20" w:after="20"/>
+            </w:pPr>
+            <w:r/>
+            <w:r>
+              <w:rPr>
+                <w:rFonts w:ascii="Calibri" w:hAnsi="Calibri"/>
+                <w:b w:val="0"/>
+                <w:sz w:val="15"/>
+              </w:rPr>
+              <w:t>Smart City &amp; Pemerintahan Digital</w:t>
+            </w:r>
+          </w:p>
+        </w:tc>
+        <w:tc>
+          <w:tcPr>
+            <w:tcW w:type="dxa" w:w="624"/>
+          </w:tcPr>
+          <w:p>
+            <w:pPr>
+              <w:spacing w:before="20" w:after="20"/>
+              <w:jc w:val="center"/>
+            </w:pPr>
+            <w:r/>
+            <w:r>
+              <w:rPr>
+                <w:rFonts w:ascii="Calibri" w:hAnsi="Calibri"/>
+                <w:b w:val="0"/>
+                <w:sz w:val="15"/>
+              </w:rPr>
+              <w:t>2</w:t>
+            </w:r>
+          </w:p>
+        </w:tc>
+        <w:tc>
+          <w:tcPr>
+            <w:tcW w:type="dxa" w:w="3628"/>
+          </w:tcPr>
+          <w:p>
+            <w:pPr>
+              <w:spacing w:before="20" w:after="20"/>
+            </w:pPr>
+            <w:r/>
+            <w:r>
+              <w:rPr>
+                <w:rFonts w:ascii="Calibri" w:hAnsi="Calibri"/>
+                <w:b w:val="0"/>
+                <w:sz w:val="15"/>
+              </w:rPr>
+              <w:t>Paket wajib</w:t>
+            </w:r>
+          </w:p>
+        </w:tc>
+        <w:tc>
+          <w:tcPr>
+            <w:tcW w:type="dxa" w:w="1928"/>
+          </w:tcPr>
+          <w:p>
+            <w:pPr>
+              <w:spacing w:before="20" w:after="20"/>
+            </w:pPr>
+            <w:r/>
+            <w:r>
+              <w:rPr>
+                <w:rFonts w:ascii="Calibri" w:hAnsi="Calibri"/>
+                <w:b w:val="0"/>
+                <w:sz w:val="15"/>
+              </w:rPr>
+              <w:t>STI-637</w:t>
             </w:r>
           </w:p>
         </w:tc>
@@ -19731,7 +21271,7 @@
                 <w:b w:val="0"/>
                 <w:sz w:val="15"/>
               </w:rPr>
-              <w:t>5</w:t>
+              <w:t>6</w:t>
             </w:r>
           </w:p>
         </w:tc>
@@ -19750,7 +21290,7 @@
                 <w:b w:val="0"/>
                 <w:sz w:val="15"/>
               </w:rPr>
-              <w:t>STI-522</w:t>
+              <w:t>STI-626</w:t>
             </w:r>
           </w:p>
         </w:tc>
@@ -19769,7 +21309,7 @@
                 <w:b w:val="0"/>
                 <w:sz w:val="15"/>
               </w:rPr>
-              <w:t>Pemrograman Aplikasi Mobile</w:t>
+              <w:t>Deep Learning &amp; Neural Networks</w:t>
             </w:r>
           </w:p>
         </w:tc>
@@ -19827,147 +21367,7 @@
                 <w:b w:val="0"/>
                 <w:sz w:val="15"/>
               </w:rPr>
-              <w:t>STI-419</w:t>
-            </w:r>
-          </w:p>
-        </w:tc>
-        <w:tc>
-          <w:tcPr>
-            <w:tcW w:type="dxa" w:w="1928"/>
-            <w:shd w:fill="C6EFCE"/>
-          </w:tcPr>
-          <w:p>
-            <w:pPr>
-              <w:spacing w:before="20" w:after="20"/>
-              <w:jc w:val="center"/>
-            </w:pPr>
-            <w:r/>
-            <w:r>
-              <w:rPr>
-                <w:rFonts w:ascii="Calibri" w:hAnsi="Calibri"/>
-                <w:b/>
-                <w:color w:val="006100"/>
-                <w:sz w:val="15"/>
-              </w:rPr>
-              <w:t>Diakui penuh</w:t>
-            </w:r>
-          </w:p>
-        </w:tc>
-      </w:tr>
-      <w:tr>
-        <w:tc>
-          <w:tcPr>
-            <w:tcW w:type="dxa" w:w="624"/>
-          </w:tcPr>
-          <w:p>
-            <w:pPr>
-              <w:spacing w:before="20" w:after="20"/>
-              <w:jc w:val="center"/>
-            </w:pPr>
-            <w:r/>
-            <w:r>
-              <w:rPr>
-                <w:rFonts w:ascii="Calibri" w:hAnsi="Calibri"/>
-                <w:b w:val="0"/>
-                <w:sz w:val="15"/>
-              </w:rPr>
-              <w:t>5</w:t>
-            </w:r>
-          </w:p>
-        </w:tc>
-        <w:tc>
-          <w:tcPr>
-            <w:tcW w:type="dxa" w:w="1247"/>
-          </w:tcPr>
-          <w:p>
-            <w:pPr>
-              <w:spacing w:before="20" w:after="20"/>
-            </w:pPr>
-            <w:r/>
-            <w:r>
-              <w:rPr>
-                <w:rFonts w:ascii="Calibri" w:hAnsi="Calibri"/>
-                <w:b w:val="0"/>
-                <w:sz w:val="15"/>
-              </w:rPr>
-              <w:t>STI-523</w:t>
-            </w:r>
-          </w:p>
-        </w:tc>
-        <w:tc>
-          <w:tcPr>
-            <w:tcW w:type="dxa" w:w="4195"/>
-          </w:tcPr>
-          <w:p>
-            <w:pPr>
-              <w:spacing w:before="20" w:after="20"/>
-            </w:pPr>
-            <w:r/>
-            <w:r>
-              <w:rPr>
-                <w:rFonts w:ascii="Calibri" w:hAnsi="Calibri"/>
-                <w:b w:val="0"/>
-                <w:sz w:val="15"/>
-              </w:rPr>
-              <w:t>Manajemen Proyek TI</w:t>
-            </w:r>
-          </w:p>
-        </w:tc>
-        <w:tc>
-          <w:tcPr>
-            <w:tcW w:type="dxa" w:w="624"/>
-          </w:tcPr>
-          <w:p>
-            <w:pPr>
-              <w:spacing w:before="20" w:after="20"/>
-              <w:jc w:val="center"/>
-            </w:pPr>
-            <w:r/>
-            <w:r>
-              <w:rPr>
-                <w:rFonts w:ascii="Calibri" w:hAnsi="Calibri"/>
-                <w:b w:val="0"/>
-                <w:sz w:val="15"/>
-              </w:rPr>
-              <w:t>3</w:t>
-            </w:r>
-          </w:p>
-        </w:tc>
-        <w:tc>
-          <w:tcPr>
-            <w:tcW w:type="dxa" w:w="3628"/>
-          </w:tcPr>
-          <w:p>
-            <w:pPr>
-              <w:spacing w:before="20" w:after="20"/>
-            </w:pPr>
-            <w:r/>
-            <w:r>
-              <w:rPr>
-                <w:rFonts w:ascii="Calibri" w:hAnsi="Calibri"/>
-                <w:b w:val="0"/>
-                <w:sz w:val="15"/>
-              </w:rPr>
-              <w:t>Paket wajib</w:t>
-            </w:r>
-          </w:p>
-        </w:tc>
-        <w:tc>
-          <w:tcPr>
-            <w:tcW w:type="dxa" w:w="1928"/>
-          </w:tcPr>
-          <w:p>
-            <w:pPr>
-              <w:spacing w:before="20" w:after="20"/>
-            </w:pPr>
-            <w:r/>
-            <w:r>
-              <w:rPr>
-                <w:rFonts w:ascii="Calibri" w:hAnsi="Calibri"/>
-                <w:b w:val="0"/>
-                <w:sz w:val="15"/>
-              </w:rPr>
-              <w:t>STI-421</w:t>
+              <w:t>STI-634</w:t>
             </w:r>
           </w:p>
         </w:tc>
@@ -19990,1406 +21390,6 @@
                 <w:sz w:val="15"/>
               </w:rPr>
               <w:t>Diakui bersyarat</w:t>
-            </w:r>
-          </w:p>
-        </w:tc>
-      </w:tr>
-      <w:tr>
-        <w:tc>
-          <w:tcPr>
-            <w:tcW w:type="dxa" w:w="624"/>
-          </w:tcPr>
-          <w:p>
-            <w:pPr>
-              <w:spacing w:before="20" w:after="20"/>
-              <w:jc w:val="center"/>
-            </w:pPr>
-            <w:r/>
-            <w:r>
-              <w:rPr>
-                <w:rFonts w:ascii="Calibri" w:hAnsi="Calibri"/>
-                <w:b w:val="0"/>
-                <w:sz w:val="15"/>
-              </w:rPr>
-              <w:t>6</w:t>
-            </w:r>
-          </w:p>
-        </w:tc>
-        <w:tc>
-          <w:tcPr>
-            <w:tcW w:type="dxa" w:w="1247"/>
-          </w:tcPr>
-          <w:p>
-            <w:pPr>
-              <w:spacing w:before="20" w:after="20"/>
-            </w:pPr>
-            <w:r/>
-            <w:r>
-              <w:rPr>
-                <w:rFonts w:ascii="Calibri" w:hAnsi="Calibri"/>
-                <w:b w:val="0"/>
-                <w:sz w:val="15"/>
-              </w:rPr>
-              <w:t>FST-611</w:t>
-            </w:r>
-          </w:p>
-        </w:tc>
-        <w:tc>
-          <w:tcPr>
-            <w:tcW w:type="dxa" w:w="4195"/>
-          </w:tcPr>
-          <w:p>
-            <w:pPr>
-              <w:spacing w:before="20" w:after="20"/>
-            </w:pPr>
-            <w:r/>
-            <w:r>
-              <w:rPr>
-                <w:rFonts w:ascii="Calibri" w:hAnsi="Calibri"/>
-                <w:b w:val="0"/>
-                <w:sz w:val="15"/>
-              </w:rPr>
-              <w:t>Metodologi Penelitian</w:t>
-            </w:r>
-          </w:p>
-        </w:tc>
-        <w:tc>
-          <w:tcPr>
-            <w:tcW w:type="dxa" w:w="624"/>
-          </w:tcPr>
-          <w:p>
-            <w:pPr>
-              <w:spacing w:before="20" w:after="20"/>
-              <w:jc w:val="center"/>
-            </w:pPr>
-            <w:r/>
-            <w:r>
-              <w:rPr>
-                <w:rFonts w:ascii="Calibri" w:hAnsi="Calibri"/>
-                <w:b w:val="0"/>
-                <w:sz w:val="15"/>
-              </w:rPr>
-              <w:t>2</w:t>
-            </w:r>
-          </w:p>
-        </w:tc>
-        <w:tc>
-          <w:tcPr>
-            <w:tcW w:type="dxa" w:w="3628"/>
-          </w:tcPr>
-          <w:p>
-            <w:pPr>
-              <w:spacing w:before="20" w:after="20"/>
-            </w:pPr>
-            <w:r/>
-            <w:r>
-              <w:rPr>
-                <w:rFonts w:ascii="Calibri" w:hAnsi="Calibri"/>
-                <w:b w:val="0"/>
-                <w:sz w:val="15"/>
-              </w:rPr>
-              <w:t>Paket wajib</w:t>
-            </w:r>
-          </w:p>
-        </w:tc>
-        <w:tc>
-          <w:tcPr>
-            <w:tcW w:type="dxa" w:w="1928"/>
-          </w:tcPr>
-          <w:p>
-            <w:pPr>
-              <w:spacing w:before="20" w:after="20"/>
-            </w:pPr>
-            <w:r/>
-            <w:r>
-              <w:rPr>
-                <w:rFonts w:ascii="Calibri" w:hAnsi="Calibri"/>
-                <w:b w:val="0"/>
-                <w:sz w:val="15"/>
-              </w:rPr>
-              <w:t>MFT-002</w:t>
-            </w:r>
-          </w:p>
-        </w:tc>
-        <w:tc>
-          <w:tcPr>
-            <w:tcW w:type="dxa" w:w="1928"/>
-            <w:shd w:fill="C6EFCE"/>
-          </w:tcPr>
-          <w:p>
-            <w:pPr>
-              <w:spacing w:before="20" w:after="20"/>
-              <w:jc w:val="center"/>
-            </w:pPr>
-            <w:r/>
-            <w:r>
-              <w:rPr>
-                <w:rFonts w:ascii="Calibri" w:hAnsi="Calibri"/>
-                <w:b/>
-                <w:color w:val="006100"/>
-                <w:sz w:val="15"/>
-              </w:rPr>
-              <w:t>Diakui penuh</w:t>
-            </w:r>
-          </w:p>
-        </w:tc>
-      </w:tr>
-      <w:tr>
-        <w:tc>
-          <w:tcPr>
-            <w:tcW w:type="dxa" w:w="624"/>
-          </w:tcPr>
-          <w:p>
-            <w:pPr>
-              <w:spacing w:before="20" w:after="20"/>
-              <w:jc w:val="center"/>
-            </w:pPr>
-            <w:r/>
-            <w:r>
-              <w:rPr>
-                <w:rFonts w:ascii="Calibri" w:hAnsi="Calibri"/>
-                <w:b w:val="0"/>
-                <w:sz w:val="15"/>
-              </w:rPr>
-              <w:t>6</w:t>
-            </w:r>
-          </w:p>
-        </w:tc>
-        <w:tc>
-          <w:tcPr>
-            <w:tcW w:type="dxa" w:w="1247"/>
-          </w:tcPr>
-          <w:p>
-            <w:pPr>
-              <w:spacing w:before="20" w:after="20"/>
-            </w:pPr>
-            <w:r/>
-            <w:r>
-              <w:rPr>
-                <w:rFonts w:ascii="Calibri" w:hAnsi="Calibri"/>
-                <w:b w:val="0"/>
-                <w:sz w:val="15"/>
-              </w:rPr>
-              <w:t>STA-02</w:t>
-            </w:r>
-          </w:p>
-        </w:tc>
-        <w:tc>
-          <w:tcPr>
-            <w:tcW w:type="dxa" w:w="4195"/>
-          </w:tcPr>
-          <w:p>
-            <w:pPr>
-              <w:spacing w:before="20" w:after="20"/>
-            </w:pPr>
-            <w:r/>
-            <w:r>
-              <w:rPr>
-                <w:rFonts w:ascii="Calibri" w:hAnsi="Calibri"/>
-                <w:b w:val="0"/>
-                <w:sz w:val="15"/>
-              </w:rPr>
-              <w:t>Computational Methods and Numerics</w:t>
-            </w:r>
-          </w:p>
-        </w:tc>
-        <w:tc>
-          <w:tcPr>
-            <w:tcW w:type="dxa" w:w="624"/>
-          </w:tcPr>
-          <w:p>
-            <w:pPr>
-              <w:spacing w:before="20" w:after="20"/>
-              <w:jc w:val="center"/>
-            </w:pPr>
-            <w:r/>
-            <w:r>
-              <w:rPr>
-                <w:rFonts w:ascii="Calibri" w:hAnsi="Calibri"/>
-                <w:b w:val="0"/>
-                <w:sz w:val="15"/>
-              </w:rPr>
-              <w:t>3</w:t>
-            </w:r>
-          </w:p>
-        </w:tc>
-        <w:tc>
-          <w:tcPr>
-            <w:tcW w:type="dxa" w:w="3628"/>
-          </w:tcPr>
-          <w:p>
-            <w:pPr>
-              <w:spacing w:before="20" w:after="20"/>
-            </w:pPr>
-            <w:r/>
-            <w:r>
-              <w:rPr>
-                <w:rFonts w:ascii="Calibri" w:hAnsi="Calibri"/>
-                <w:b w:val="0"/>
-                <w:sz w:val="15"/>
-              </w:rPr>
-              <w:t>P1 Integrated Smart Systems</w:t>
-            </w:r>
-          </w:p>
-        </w:tc>
-        <w:tc>
-          <w:tcPr>
-            <w:tcW w:type="dxa" w:w="1928"/>
-          </w:tcPr>
-          <w:p>
-            <w:pPr>
-              <w:spacing w:before="20" w:after="20"/>
-            </w:pPr>
-            <w:r/>
-            <w:r>
-              <w:rPr>
-                <w:rFonts w:ascii="Calibri" w:hAnsi="Calibri"/>
-                <w:b w:val="0"/>
-                <w:sz w:val="15"/>
-              </w:rPr>
-              <w:t>STI-317</w:t>
-            </w:r>
-          </w:p>
-        </w:tc>
-        <w:tc>
-          <w:tcPr>
-            <w:tcW w:type="dxa" w:w="1928"/>
-            <w:shd w:fill="FFEB9C"/>
-          </w:tcPr>
-          <w:p>
-            <w:pPr>
-              <w:spacing w:before="20" w:after="20"/>
-              <w:jc w:val="center"/>
-            </w:pPr>
-            <w:r/>
-            <w:r>
-              <w:rPr>
-                <w:rFonts w:ascii="Calibri" w:hAnsi="Calibri"/>
-                <w:b/>
-                <w:color w:val="9C5700"/>
-                <w:sz w:val="15"/>
-              </w:rPr>
-              <w:t>Diakui bersyarat</w:t>
-            </w:r>
-          </w:p>
-        </w:tc>
-      </w:tr>
-      <w:tr>
-        <w:tc>
-          <w:tcPr>
-            <w:tcW w:type="dxa" w:w="624"/>
-          </w:tcPr>
-          <w:p>
-            <w:pPr>
-              <w:spacing w:before="20" w:after="20"/>
-              <w:jc w:val="center"/>
-            </w:pPr>
-            <w:r/>
-            <w:r>
-              <w:rPr>
-                <w:rFonts w:ascii="Calibri" w:hAnsi="Calibri"/>
-                <w:b w:val="0"/>
-                <w:sz w:val="15"/>
-              </w:rPr>
-              <w:t>6</w:t>
-            </w:r>
-          </w:p>
-        </w:tc>
-        <w:tc>
-          <w:tcPr>
-            <w:tcW w:type="dxa" w:w="1247"/>
-          </w:tcPr>
-          <w:p>
-            <w:pPr>
-              <w:spacing w:before="20" w:after="20"/>
-            </w:pPr>
-            <w:r/>
-            <w:r>
-              <w:rPr>
-                <w:rFonts w:ascii="Calibri" w:hAnsi="Calibri"/>
-                <w:b w:val="0"/>
-                <w:sz w:val="15"/>
-              </w:rPr>
-              <w:t>STA-03</w:t>
-            </w:r>
-          </w:p>
-        </w:tc>
-        <w:tc>
-          <w:tcPr>
-            <w:tcW w:type="dxa" w:w="4195"/>
-          </w:tcPr>
-          <w:p>
-            <w:pPr>
-              <w:spacing w:before="20" w:after="20"/>
-            </w:pPr>
-            <w:r/>
-            <w:r>
-              <w:rPr>
-                <w:rFonts w:ascii="Calibri" w:hAnsi="Calibri"/>
-                <w:b w:val="0"/>
-                <w:sz w:val="15"/>
-              </w:rPr>
-              <w:t>Intelligent Agent Systems</w:t>
-            </w:r>
-          </w:p>
-        </w:tc>
-        <w:tc>
-          <w:tcPr>
-            <w:tcW w:type="dxa" w:w="624"/>
-          </w:tcPr>
-          <w:p>
-            <w:pPr>
-              <w:spacing w:before="20" w:after="20"/>
-              <w:jc w:val="center"/>
-            </w:pPr>
-            <w:r/>
-            <w:r>
-              <w:rPr>
-                <w:rFonts w:ascii="Calibri" w:hAnsi="Calibri"/>
-                <w:b w:val="0"/>
-                <w:sz w:val="15"/>
-              </w:rPr>
-              <w:t>3</w:t>
-            </w:r>
-          </w:p>
-        </w:tc>
-        <w:tc>
-          <w:tcPr>
-            <w:tcW w:type="dxa" w:w="3628"/>
-          </w:tcPr>
-          <w:p>
-            <w:pPr>
-              <w:spacing w:before="20" w:after="20"/>
-            </w:pPr>
-            <w:r/>
-            <w:r>
-              <w:rPr>
-                <w:rFonts w:ascii="Calibri" w:hAnsi="Calibri"/>
-                <w:b w:val="0"/>
-                <w:sz w:val="15"/>
-              </w:rPr>
-              <w:t>P1 Integrated Smart Systems</w:t>
-            </w:r>
-          </w:p>
-        </w:tc>
-        <w:tc>
-          <w:tcPr>
-            <w:tcW w:type="dxa" w:w="1928"/>
-          </w:tcPr>
-          <w:p>
-            <w:pPr>
-              <w:spacing w:before="20" w:after="20"/>
-            </w:pPr>
-            <w:r/>
-            <w:r>
-              <w:rPr>
-                <w:rFonts w:ascii="Calibri" w:hAnsi="Calibri"/>
-                <w:b w:val="0"/>
-                <w:sz w:val="15"/>
-              </w:rPr>
-              <w:t>—</w:t>
-            </w:r>
-          </w:p>
-        </w:tc>
-        <w:tc>
-          <w:tcPr>
-            <w:tcW w:type="dxa" w:w="1928"/>
-            <w:shd w:fill="FFC7CE"/>
-          </w:tcPr>
-          <w:p>
-            <w:pPr>
-              <w:spacing w:before="20" w:after="20"/>
-              <w:jc w:val="center"/>
-            </w:pPr>
-            <w:r/>
-            <w:r>
-              <w:rPr>
-                <w:rFonts w:ascii="Calibri" w:hAnsi="Calibri"/>
-                <w:b/>
-                <w:color w:val="9C0006"/>
-                <w:sz w:val="15"/>
-              </w:rPr>
-              <w:t>Wajib ditempuh</w:t>
-            </w:r>
-          </w:p>
-        </w:tc>
-      </w:tr>
-      <w:tr>
-        <w:tc>
-          <w:tcPr>
-            <w:tcW w:type="dxa" w:w="624"/>
-          </w:tcPr>
-          <w:p>
-            <w:pPr>
-              <w:spacing w:before="20" w:after="20"/>
-              <w:jc w:val="center"/>
-            </w:pPr>
-            <w:r/>
-            <w:r>
-              <w:rPr>
-                <w:rFonts w:ascii="Calibri" w:hAnsi="Calibri"/>
-                <w:b w:val="0"/>
-                <w:sz w:val="15"/>
-              </w:rPr>
-              <w:t>6</w:t>
-            </w:r>
-          </w:p>
-        </w:tc>
-        <w:tc>
-          <w:tcPr>
-            <w:tcW w:type="dxa" w:w="1247"/>
-          </w:tcPr>
-          <w:p>
-            <w:pPr>
-              <w:spacing w:before="20" w:after="20"/>
-            </w:pPr>
-            <w:r/>
-            <w:r>
-              <w:rPr>
-                <w:rFonts w:ascii="Calibri" w:hAnsi="Calibri"/>
-                <w:b w:val="0"/>
-                <w:sz w:val="15"/>
-              </w:rPr>
-              <w:t>STB-02</w:t>
-            </w:r>
-          </w:p>
-        </w:tc>
-        <w:tc>
-          <w:tcPr>
-            <w:tcW w:type="dxa" w:w="4195"/>
-          </w:tcPr>
-          <w:p>
-            <w:pPr>
-              <w:spacing w:before="20" w:after="20"/>
-            </w:pPr>
-            <w:r/>
-            <w:r>
-              <w:rPr>
-                <w:rFonts w:ascii="Calibri" w:hAnsi="Calibri"/>
-                <w:b w:val="0"/>
-                <w:sz w:val="15"/>
-              </w:rPr>
-              <w:t>Cloud Architecture &amp; DevOps</w:t>
-            </w:r>
-          </w:p>
-        </w:tc>
-        <w:tc>
-          <w:tcPr>
-            <w:tcW w:type="dxa" w:w="624"/>
-          </w:tcPr>
-          <w:p>
-            <w:pPr>
-              <w:spacing w:before="20" w:after="20"/>
-              <w:jc w:val="center"/>
-            </w:pPr>
-            <w:r/>
-            <w:r>
-              <w:rPr>
-                <w:rFonts w:ascii="Calibri" w:hAnsi="Calibri"/>
-                <w:b w:val="0"/>
-                <w:sz w:val="15"/>
-              </w:rPr>
-              <w:t>3</w:t>
-            </w:r>
-          </w:p>
-        </w:tc>
-        <w:tc>
-          <w:tcPr>
-            <w:tcW w:type="dxa" w:w="3628"/>
-          </w:tcPr>
-          <w:p>
-            <w:pPr>
-              <w:spacing w:before="20" w:after="20"/>
-            </w:pPr>
-            <w:r/>
-            <w:r>
-              <w:rPr>
-                <w:rFonts w:ascii="Calibri" w:hAnsi="Calibri"/>
-                <w:b w:val="0"/>
-                <w:sz w:val="15"/>
-              </w:rPr>
-              <w:t>P2 Cloud Infrastructure &amp; Cybersecurity</w:t>
-            </w:r>
-          </w:p>
-        </w:tc>
-        <w:tc>
-          <w:tcPr>
-            <w:tcW w:type="dxa" w:w="1928"/>
-          </w:tcPr>
-          <w:p>
-            <w:pPr>
-              <w:spacing w:before="20" w:after="20"/>
-            </w:pPr>
-            <w:r/>
-            <w:r>
-              <w:rPr>
-                <w:rFonts w:ascii="Calibri" w:hAnsi="Calibri"/>
-                <w:b w:val="0"/>
-                <w:sz w:val="15"/>
-              </w:rPr>
-              <w:t>—</w:t>
-            </w:r>
-          </w:p>
-        </w:tc>
-        <w:tc>
-          <w:tcPr>
-            <w:tcW w:type="dxa" w:w="1928"/>
-            <w:shd w:fill="FFC7CE"/>
-          </w:tcPr>
-          <w:p>
-            <w:pPr>
-              <w:spacing w:before="20" w:after="20"/>
-              <w:jc w:val="center"/>
-            </w:pPr>
-            <w:r/>
-            <w:r>
-              <w:rPr>
-                <w:rFonts w:ascii="Calibri" w:hAnsi="Calibri"/>
-                <w:b/>
-                <w:color w:val="9C0006"/>
-                <w:sz w:val="15"/>
-              </w:rPr>
-              <w:t>Wajib ditempuh</w:t>
-            </w:r>
-          </w:p>
-        </w:tc>
-      </w:tr>
-      <w:tr>
-        <w:tc>
-          <w:tcPr>
-            <w:tcW w:type="dxa" w:w="624"/>
-          </w:tcPr>
-          <w:p>
-            <w:pPr>
-              <w:spacing w:before="20" w:after="20"/>
-              <w:jc w:val="center"/>
-            </w:pPr>
-            <w:r/>
-            <w:r>
-              <w:rPr>
-                <w:rFonts w:ascii="Calibri" w:hAnsi="Calibri"/>
-                <w:b w:val="0"/>
-                <w:sz w:val="15"/>
-              </w:rPr>
-              <w:t>6</w:t>
-            </w:r>
-          </w:p>
-        </w:tc>
-        <w:tc>
-          <w:tcPr>
-            <w:tcW w:type="dxa" w:w="1247"/>
-          </w:tcPr>
-          <w:p>
-            <w:pPr>
-              <w:spacing w:before="20" w:after="20"/>
-            </w:pPr>
-            <w:r/>
-            <w:r>
-              <w:rPr>
-                <w:rFonts w:ascii="Calibri" w:hAnsi="Calibri"/>
-                <w:b w:val="0"/>
-                <w:sz w:val="15"/>
-              </w:rPr>
-              <w:t>STB-03</w:t>
-            </w:r>
-          </w:p>
-        </w:tc>
-        <w:tc>
-          <w:tcPr>
-            <w:tcW w:type="dxa" w:w="4195"/>
-          </w:tcPr>
-          <w:p>
-            <w:pPr>
-              <w:spacing w:before="20" w:after="20"/>
-            </w:pPr>
-            <w:r/>
-            <w:r>
-              <w:rPr>
-                <w:rFonts w:ascii="Calibri" w:hAnsi="Calibri"/>
-                <w:b w:val="0"/>
-                <w:sz w:val="15"/>
-              </w:rPr>
-              <w:t>Cybersecurity Risk Management</w:t>
-            </w:r>
-          </w:p>
-        </w:tc>
-        <w:tc>
-          <w:tcPr>
-            <w:tcW w:type="dxa" w:w="624"/>
-          </w:tcPr>
-          <w:p>
-            <w:pPr>
-              <w:spacing w:before="20" w:after="20"/>
-              <w:jc w:val="center"/>
-            </w:pPr>
-            <w:r/>
-            <w:r>
-              <w:rPr>
-                <w:rFonts w:ascii="Calibri" w:hAnsi="Calibri"/>
-                <w:b w:val="0"/>
-                <w:sz w:val="15"/>
-              </w:rPr>
-              <w:t>3</w:t>
-            </w:r>
-          </w:p>
-        </w:tc>
-        <w:tc>
-          <w:tcPr>
-            <w:tcW w:type="dxa" w:w="3628"/>
-          </w:tcPr>
-          <w:p>
-            <w:pPr>
-              <w:spacing w:before="20" w:after="20"/>
-            </w:pPr>
-            <w:r/>
-            <w:r>
-              <w:rPr>
-                <w:rFonts w:ascii="Calibri" w:hAnsi="Calibri"/>
-                <w:b w:val="0"/>
-                <w:sz w:val="15"/>
-              </w:rPr>
-              <w:t>P2 Cloud Infrastructure &amp; Cybersecurity</w:t>
-            </w:r>
-          </w:p>
-        </w:tc>
-        <w:tc>
-          <w:tcPr>
-            <w:tcW w:type="dxa" w:w="1928"/>
-          </w:tcPr>
-          <w:p>
-            <w:pPr>
-              <w:spacing w:before="20" w:after="20"/>
-            </w:pPr>
-            <w:r/>
-            <w:r>
-              <w:rPr>
-                <w:rFonts w:ascii="Calibri" w:hAnsi="Calibri"/>
-                <w:b w:val="0"/>
-                <w:sz w:val="15"/>
-              </w:rPr>
-              <w:t>—</w:t>
-            </w:r>
-          </w:p>
-        </w:tc>
-        <w:tc>
-          <w:tcPr>
-            <w:tcW w:type="dxa" w:w="1928"/>
-            <w:shd w:fill="FFC7CE"/>
-          </w:tcPr>
-          <w:p>
-            <w:pPr>
-              <w:spacing w:before="20" w:after="20"/>
-              <w:jc w:val="center"/>
-            </w:pPr>
-            <w:r/>
-            <w:r>
-              <w:rPr>
-                <w:rFonts w:ascii="Calibri" w:hAnsi="Calibri"/>
-                <w:b/>
-                <w:color w:val="9C0006"/>
-                <w:sz w:val="15"/>
-              </w:rPr>
-              <w:t>Wajib ditempuh</w:t>
-            </w:r>
-          </w:p>
-        </w:tc>
-      </w:tr>
-      <w:tr>
-        <w:tc>
-          <w:tcPr>
-            <w:tcW w:type="dxa" w:w="624"/>
-          </w:tcPr>
-          <w:p>
-            <w:pPr>
-              <w:spacing w:before="20" w:after="20"/>
-              <w:jc w:val="center"/>
-            </w:pPr>
-            <w:r/>
-            <w:r>
-              <w:rPr>
-                <w:rFonts w:ascii="Calibri" w:hAnsi="Calibri"/>
-                <w:b w:val="0"/>
-                <w:sz w:val="15"/>
-              </w:rPr>
-              <w:t>6</w:t>
-            </w:r>
-          </w:p>
-        </w:tc>
-        <w:tc>
-          <w:tcPr>
-            <w:tcW w:type="dxa" w:w="1247"/>
-          </w:tcPr>
-          <w:p>
-            <w:pPr>
-              <w:spacing w:before="20" w:after="20"/>
-            </w:pPr>
-            <w:r/>
-            <w:r>
-              <w:rPr>
-                <w:rFonts w:ascii="Calibri" w:hAnsi="Calibri"/>
-                <w:b w:val="0"/>
-                <w:sz w:val="15"/>
-              </w:rPr>
-              <w:t>STC-02</w:t>
-            </w:r>
-          </w:p>
-        </w:tc>
-        <w:tc>
-          <w:tcPr>
-            <w:tcW w:type="dxa" w:w="4195"/>
-          </w:tcPr>
-          <w:p>
-            <w:pPr>
-              <w:spacing w:before="20" w:after="20"/>
-            </w:pPr>
-            <w:r/>
-            <w:r>
-              <w:rPr>
-                <w:rFonts w:ascii="Calibri" w:hAnsi="Calibri"/>
-                <w:b w:val="0"/>
-                <w:sz w:val="15"/>
-              </w:rPr>
-              <w:t>Rekayasa &amp; Otomasi Proses Bisnis (BPA)</w:t>
-            </w:r>
-          </w:p>
-        </w:tc>
-        <w:tc>
-          <w:tcPr>
-            <w:tcW w:type="dxa" w:w="624"/>
-          </w:tcPr>
-          <w:p>
-            <w:pPr>
-              <w:spacing w:before="20" w:after="20"/>
-              <w:jc w:val="center"/>
-            </w:pPr>
-            <w:r/>
-            <w:r>
-              <w:rPr>
-                <w:rFonts w:ascii="Calibri" w:hAnsi="Calibri"/>
-                <w:b w:val="0"/>
-                <w:sz w:val="15"/>
-              </w:rPr>
-              <w:t>3</w:t>
-            </w:r>
-          </w:p>
-        </w:tc>
-        <w:tc>
-          <w:tcPr>
-            <w:tcW w:type="dxa" w:w="3628"/>
-          </w:tcPr>
-          <w:p>
-            <w:pPr>
-              <w:spacing w:before="20" w:after="20"/>
-            </w:pPr>
-            <w:r/>
-            <w:r>
-              <w:rPr>
-                <w:rFonts w:ascii="Calibri" w:hAnsi="Calibri"/>
-                <w:b w:val="0"/>
-                <w:sz w:val="15"/>
-              </w:rPr>
-              <w:t>P3 Digital Platform Engineering</w:t>
-            </w:r>
-          </w:p>
-        </w:tc>
-        <w:tc>
-          <w:tcPr>
-            <w:tcW w:type="dxa" w:w="1928"/>
-          </w:tcPr>
-          <w:p>
-            <w:pPr>
-              <w:spacing w:before="20" w:after="20"/>
-            </w:pPr>
-            <w:r/>
-            <w:r>
-              <w:rPr>
-                <w:rFonts w:ascii="Calibri" w:hAnsi="Calibri"/>
-                <w:b w:val="0"/>
-                <w:sz w:val="15"/>
-              </w:rPr>
-              <w:t>—</w:t>
-            </w:r>
-          </w:p>
-        </w:tc>
-        <w:tc>
-          <w:tcPr>
-            <w:tcW w:type="dxa" w:w="1928"/>
-            <w:shd w:fill="FFC7CE"/>
-          </w:tcPr>
-          <w:p>
-            <w:pPr>
-              <w:spacing w:before="20" w:after="20"/>
-              <w:jc w:val="center"/>
-            </w:pPr>
-            <w:r/>
-            <w:r>
-              <w:rPr>
-                <w:rFonts w:ascii="Calibri" w:hAnsi="Calibri"/>
-                <w:b/>
-                <w:color w:val="9C0006"/>
-                <w:sz w:val="15"/>
-              </w:rPr>
-              <w:t>Wajib ditempuh</w:t>
-            </w:r>
-          </w:p>
-        </w:tc>
-      </w:tr>
-      <w:tr>
-        <w:tc>
-          <w:tcPr>
-            <w:tcW w:type="dxa" w:w="624"/>
-          </w:tcPr>
-          <w:p>
-            <w:pPr>
-              <w:spacing w:before="20" w:after="20"/>
-              <w:jc w:val="center"/>
-            </w:pPr>
-            <w:r/>
-            <w:r>
-              <w:rPr>
-                <w:rFonts w:ascii="Calibri" w:hAnsi="Calibri"/>
-                <w:b w:val="0"/>
-                <w:sz w:val="15"/>
-              </w:rPr>
-              <w:t>6</w:t>
-            </w:r>
-          </w:p>
-        </w:tc>
-        <w:tc>
-          <w:tcPr>
-            <w:tcW w:type="dxa" w:w="1247"/>
-          </w:tcPr>
-          <w:p>
-            <w:pPr>
-              <w:spacing w:before="20" w:after="20"/>
-            </w:pPr>
-            <w:r/>
-            <w:r>
-              <w:rPr>
-                <w:rFonts w:ascii="Calibri" w:hAnsi="Calibri"/>
-                <w:b w:val="0"/>
-                <w:sz w:val="15"/>
-              </w:rPr>
-              <w:t>STC-03</w:t>
-            </w:r>
-          </w:p>
-        </w:tc>
-        <w:tc>
-          <w:tcPr>
-            <w:tcW w:type="dxa" w:w="4195"/>
-          </w:tcPr>
-          <w:p>
-            <w:pPr>
-              <w:spacing w:before="20" w:after="20"/>
-            </w:pPr>
-            <w:r/>
-            <w:r>
-              <w:rPr>
-                <w:rFonts w:ascii="Calibri" w:hAnsi="Calibri"/>
-                <w:b w:val="0"/>
-                <w:sz w:val="15"/>
-              </w:rPr>
-              <w:t>Rekayasa Aplikasi Industri Vertikal (FinTech &amp; EdTech)</w:t>
-            </w:r>
-          </w:p>
-        </w:tc>
-        <w:tc>
-          <w:tcPr>
-            <w:tcW w:type="dxa" w:w="624"/>
-          </w:tcPr>
-          <w:p>
-            <w:pPr>
-              <w:spacing w:before="20" w:after="20"/>
-              <w:jc w:val="center"/>
-            </w:pPr>
-            <w:r/>
-            <w:r>
-              <w:rPr>
-                <w:rFonts w:ascii="Calibri" w:hAnsi="Calibri"/>
-                <w:b w:val="0"/>
-                <w:sz w:val="15"/>
-              </w:rPr>
-              <w:t>3</w:t>
-            </w:r>
-          </w:p>
-        </w:tc>
-        <w:tc>
-          <w:tcPr>
-            <w:tcW w:type="dxa" w:w="3628"/>
-          </w:tcPr>
-          <w:p>
-            <w:pPr>
-              <w:spacing w:before="20" w:after="20"/>
-            </w:pPr>
-            <w:r/>
-            <w:r>
-              <w:rPr>
-                <w:rFonts w:ascii="Calibri" w:hAnsi="Calibri"/>
-                <w:b w:val="0"/>
-                <w:sz w:val="15"/>
-              </w:rPr>
-              <w:t>P3 Digital Platform Engineering</w:t>
-            </w:r>
-          </w:p>
-        </w:tc>
-        <w:tc>
-          <w:tcPr>
-            <w:tcW w:type="dxa" w:w="1928"/>
-          </w:tcPr>
-          <w:p>
-            <w:pPr>
-              <w:spacing w:before="20" w:after="20"/>
-            </w:pPr>
-            <w:r/>
-            <w:r>
-              <w:rPr>
-                <w:rFonts w:ascii="Calibri" w:hAnsi="Calibri"/>
-                <w:b w:val="0"/>
-                <w:sz w:val="15"/>
-              </w:rPr>
-              <w:t>—</w:t>
-            </w:r>
-          </w:p>
-        </w:tc>
-        <w:tc>
-          <w:tcPr>
-            <w:tcW w:type="dxa" w:w="1928"/>
-            <w:shd w:fill="FFC7CE"/>
-          </w:tcPr>
-          <w:p>
-            <w:pPr>
-              <w:spacing w:before="20" w:after="20"/>
-              <w:jc w:val="center"/>
-            </w:pPr>
-            <w:r/>
-            <w:r>
-              <w:rPr>
-                <w:rFonts w:ascii="Calibri" w:hAnsi="Calibri"/>
-                <w:b/>
-                <w:color w:val="9C0006"/>
-                <w:sz w:val="15"/>
-              </w:rPr>
-              <w:t>Wajib ditempuh</w:t>
-            </w:r>
-          </w:p>
-        </w:tc>
-      </w:tr>
-      <w:tr>
-        <w:tc>
-          <w:tcPr>
-            <w:tcW w:type="dxa" w:w="624"/>
-          </w:tcPr>
-          <w:p>
-            <w:pPr>
-              <w:spacing w:before="20" w:after="20"/>
-              <w:jc w:val="center"/>
-            </w:pPr>
-            <w:r/>
-            <w:r>
-              <w:rPr>
-                <w:rFonts w:ascii="Calibri" w:hAnsi="Calibri"/>
-                <w:b w:val="0"/>
-                <w:sz w:val="15"/>
-              </w:rPr>
-              <w:t>6</w:t>
-            </w:r>
-          </w:p>
-        </w:tc>
-        <w:tc>
-          <w:tcPr>
-            <w:tcW w:type="dxa" w:w="1247"/>
-          </w:tcPr>
-          <w:p>
-            <w:pPr>
-              <w:spacing w:before="20" w:after="20"/>
-            </w:pPr>
-            <w:r/>
-            <w:r>
-              <w:rPr>
-                <w:rFonts w:ascii="Calibri" w:hAnsi="Calibri"/>
-                <w:b w:val="0"/>
-                <w:sz w:val="15"/>
-              </w:rPr>
-              <w:t>STI-624</w:t>
-            </w:r>
-          </w:p>
-        </w:tc>
-        <w:tc>
-          <w:tcPr>
-            <w:tcW w:type="dxa" w:w="4195"/>
-          </w:tcPr>
-          <w:p>
-            <w:pPr>
-              <w:spacing w:before="20" w:after="20"/>
-            </w:pPr>
-            <w:r/>
-            <w:r>
-              <w:rPr>
-                <w:rFonts w:ascii="Calibri" w:hAnsi="Calibri"/>
-                <w:b w:val="0"/>
-                <w:sz w:val="15"/>
-              </w:rPr>
-              <w:t>Integrasi Layanan Cerdas Berbasis AI</w:t>
-            </w:r>
-          </w:p>
-        </w:tc>
-        <w:tc>
-          <w:tcPr>
-            <w:tcW w:type="dxa" w:w="624"/>
-          </w:tcPr>
-          <w:p>
-            <w:pPr>
-              <w:spacing w:before="20" w:after="20"/>
-              <w:jc w:val="center"/>
-            </w:pPr>
-            <w:r/>
-            <w:r>
-              <w:rPr>
-                <w:rFonts w:ascii="Calibri" w:hAnsi="Calibri"/>
-                <w:b w:val="0"/>
-                <w:sz w:val="15"/>
-              </w:rPr>
-              <w:t>3</w:t>
-            </w:r>
-          </w:p>
-        </w:tc>
-        <w:tc>
-          <w:tcPr>
-            <w:tcW w:type="dxa" w:w="3628"/>
-          </w:tcPr>
-          <w:p>
-            <w:pPr>
-              <w:spacing w:before="20" w:after="20"/>
-            </w:pPr>
-            <w:r/>
-            <w:r>
-              <w:rPr>
-                <w:rFonts w:ascii="Calibri" w:hAnsi="Calibri"/>
-                <w:b w:val="0"/>
-                <w:sz w:val="15"/>
-              </w:rPr>
-              <w:t>Paket wajib</w:t>
-            </w:r>
-          </w:p>
-        </w:tc>
-        <w:tc>
-          <w:tcPr>
-            <w:tcW w:type="dxa" w:w="1928"/>
-          </w:tcPr>
-          <w:p>
-            <w:pPr>
-              <w:spacing w:before="20" w:after="20"/>
-            </w:pPr>
-            <w:r/>
-            <w:r>
-              <w:rPr>
-                <w:rFonts w:ascii="Calibri" w:hAnsi="Calibri"/>
-                <w:b w:val="0"/>
-                <w:sz w:val="15"/>
-              </w:rPr>
-              <w:t>STI-741</w:t>
-            </w:r>
-          </w:p>
-        </w:tc>
-        <w:tc>
-          <w:tcPr>
-            <w:tcW w:type="dxa" w:w="1928"/>
-            <w:shd w:fill="FFEB9C"/>
-          </w:tcPr>
-          <w:p>
-            <w:pPr>
-              <w:spacing w:before="20" w:after="20"/>
-              <w:jc w:val="center"/>
-            </w:pPr>
-            <w:r/>
-            <w:r>
-              <w:rPr>
-                <w:rFonts w:ascii="Calibri" w:hAnsi="Calibri"/>
-                <w:b/>
-                <w:color w:val="9C5700"/>
-                <w:sz w:val="15"/>
-              </w:rPr>
-              <w:t>Diakui bersyarat</w:t>
-            </w:r>
-          </w:p>
-        </w:tc>
-      </w:tr>
-      <w:tr>
-        <w:tc>
-          <w:tcPr>
-            <w:tcW w:type="dxa" w:w="624"/>
-          </w:tcPr>
-          <w:p>
-            <w:pPr>
-              <w:spacing w:before="20" w:after="20"/>
-              <w:jc w:val="center"/>
-            </w:pPr>
-            <w:r/>
-            <w:r>
-              <w:rPr>
-                <w:rFonts w:ascii="Calibri" w:hAnsi="Calibri"/>
-                <w:b w:val="0"/>
-                <w:sz w:val="15"/>
-              </w:rPr>
-              <w:t>6</w:t>
-            </w:r>
-          </w:p>
-        </w:tc>
-        <w:tc>
-          <w:tcPr>
-            <w:tcW w:type="dxa" w:w="1247"/>
-          </w:tcPr>
-          <w:p>
-            <w:pPr>
-              <w:spacing w:before="20" w:after="20"/>
-            </w:pPr>
-            <w:r/>
-            <w:r>
-              <w:rPr>
-                <w:rFonts w:ascii="Calibri" w:hAnsi="Calibri"/>
-                <w:b w:val="0"/>
-                <w:sz w:val="15"/>
-              </w:rPr>
-              <w:t>STI-625</w:t>
-            </w:r>
-          </w:p>
-        </w:tc>
-        <w:tc>
-          <w:tcPr>
-            <w:tcW w:type="dxa" w:w="4195"/>
-          </w:tcPr>
-          <w:p>
-            <w:pPr>
-              <w:spacing w:before="20" w:after="20"/>
-            </w:pPr>
-            <w:r/>
-            <w:r>
-              <w:rPr>
-                <w:rFonts w:ascii="Calibri" w:hAnsi="Calibri"/>
-                <w:b w:val="0"/>
-                <w:sz w:val="15"/>
-              </w:rPr>
-              <w:t>Smart City &amp; Pemerintahan Digital</w:t>
-            </w:r>
-          </w:p>
-        </w:tc>
-        <w:tc>
-          <w:tcPr>
-            <w:tcW w:type="dxa" w:w="624"/>
-          </w:tcPr>
-          <w:p>
-            <w:pPr>
-              <w:spacing w:before="20" w:after="20"/>
-              <w:jc w:val="center"/>
-            </w:pPr>
-            <w:r/>
-            <w:r>
-              <w:rPr>
-                <w:rFonts w:ascii="Calibri" w:hAnsi="Calibri"/>
-                <w:b w:val="0"/>
-                <w:sz w:val="15"/>
-              </w:rPr>
-              <w:t>2</w:t>
-            </w:r>
-          </w:p>
-        </w:tc>
-        <w:tc>
-          <w:tcPr>
-            <w:tcW w:type="dxa" w:w="3628"/>
-          </w:tcPr>
-          <w:p>
-            <w:pPr>
-              <w:spacing w:before="20" w:after="20"/>
-            </w:pPr>
-            <w:r/>
-            <w:r>
-              <w:rPr>
-                <w:rFonts w:ascii="Calibri" w:hAnsi="Calibri"/>
-                <w:b w:val="0"/>
-                <w:sz w:val="15"/>
-              </w:rPr>
-              <w:t>Paket wajib</w:t>
-            </w:r>
-          </w:p>
-        </w:tc>
-        <w:tc>
-          <w:tcPr>
-            <w:tcW w:type="dxa" w:w="1928"/>
-          </w:tcPr>
-          <w:p>
-            <w:pPr>
-              <w:spacing w:before="20" w:after="20"/>
-            </w:pPr>
-            <w:r/>
-            <w:r>
-              <w:rPr>
-                <w:rFonts w:ascii="Calibri" w:hAnsi="Calibri"/>
-                <w:b w:val="0"/>
-                <w:sz w:val="15"/>
-              </w:rPr>
-              <w:t>STI-637</w:t>
-            </w:r>
-          </w:p>
-        </w:tc>
-        <w:tc>
-          <w:tcPr>
-            <w:tcW w:type="dxa" w:w="1928"/>
-            <w:shd w:fill="C6EFCE"/>
-          </w:tcPr>
-          <w:p>
-            <w:pPr>
-              <w:spacing w:before="20" w:after="20"/>
-              <w:jc w:val="center"/>
-            </w:pPr>
-            <w:r/>
-            <w:r>
-              <w:rPr>
-                <w:rFonts w:ascii="Calibri" w:hAnsi="Calibri"/>
-                <w:b/>
-                <w:color w:val="006100"/>
-                <w:sz w:val="15"/>
-              </w:rPr>
-              <w:t>Diakui penuh</w:t>
-            </w:r>
-          </w:p>
-        </w:tc>
-      </w:tr>
-      <w:tr>
-        <w:tc>
-          <w:tcPr>
-            <w:tcW w:type="dxa" w:w="624"/>
-          </w:tcPr>
-          <w:p>
-            <w:pPr>
-              <w:spacing w:before="20" w:after="20"/>
-              <w:jc w:val="center"/>
-            </w:pPr>
-            <w:r/>
-            <w:r>
-              <w:rPr>
-                <w:rFonts w:ascii="Calibri" w:hAnsi="Calibri"/>
-                <w:b w:val="0"/>
-                <w:sz w:val="15"/>
-              </w:rPr>
-              <w:t>6</w:t>
-            </w:r>
-          </w:p>
-        </w:tc>
-        <w:tc>
-          <w:tcPr>
-            <w:tcW w:type="dxa" w:w="1247"/>
-          </w:tcPr>
-          <w:p>
-            <w:pPr>
-              <w:spacing w:before="20" w:after="20"/>
-            </w:pPr>
-            <w:r/>
-            <w:r>
-              <w:rPr>
-                <w:rFonts w:ascii="Calibri" w:hAnsi="Calibri"/>
-                <w:b w:val="0"/>
-                <w:sz w:val="15"/>
-              </w:rPr>
-              <w:t>STI-626</w:t>
-            </w:r>
-          </w:p>
-        </w:tc>
-        <w:tc>
-          <w:tcPr>
-            <w:tcW w:type="dxa" w:w="4195"/>
-          </w:tcPr>
-          <w:p>
-            <w:pPr>
-              <w:spacing w:before="20" w:after="20"/>
-            </w:pPr>
-            <w:r/>
-            <w:r>
-              <w:rPr>
-                <w:rFonts w:ascii="Calibri" w:hAnsi="Calibri"/>
-                <w:b w:val="0"/>
-                <w:sz w:val="15"/>
-              </w:rPr>
-              <w:t>Keamanan Informasi Lanjut</w:t>
-            </w:r>
-          </w:p>
-        </w:tc>
-        <w:tc>
-          <w:tcPr>
-            <w:tcW w:type="dxa" w:w="624"/>
-          </w:tcPr>
-          <w:p>
-            <w:pPr>
-              <w:spacing w:before="20" w:after="20"/>
-              <w:jc w:val="center"/>
-            </w:pPr>
-            <w:r/>
-            <w:r>
-              <w:rPr>
-                <w:rFonts w:ascii="Calibri" w:hAnsi="Calibri"/>
-                <w:b w:val="0"/>
-                <w:sz w:val="15"/>
-              </w:rPr>
-              <w:t>3</w:t>
-            </w:r>
-          </w:p>
-        </w:tc>
-        <w:tc>
-          <w:tcPr>
-            <w:tcW w:type="dxa" w:w="3628"/>
-          </w:tcPr>
-          <w:p>
-            <w:pPr>
-              <w:spacing w:before="20" w:after="20"/>
-            </w:pPr>
-            <w:r/>
-            <w:r>
-              <w:rPr>
-                <w:rFonts w:ascii="Calibri" w:hAnsi="Calibri"/>
-                <w:b w:val="0"/>
-                <w:sz w:val="15"/>
-              </w:rPr>
-              <w:t>Paket wajib</w:t>
-            </w:r>
-          </w:p>
-        </w:tc>
-        <w:tc>
-          <w:tcPr>
-            <w:tcW w:type="dxa" w:w="1928"/>
-          </w:tcPr>
-          <w:p>
-            <w:pPr>
-              <w:spacing w:before="20" w:after="20"/>
-            </w:pPr>
-            <w:r/>
-            <w:r>
-              <w:rPr>
-                <w:rFonts w:ascii="Calibri" w:hAnsi="Calibri"/>
-                <w:b w:val="0"/>
-                <w:sz w:val="15"/>
-              </w:rPr>
-              <w:t>—</w:t>
-            </w:r>
-          </w:p>
-        </w:tc>
-        <w:tc>
-          <w:tcPr>
-            <w:tcW w:type="dxa" w:w="1928"/>
-            <w:shd w:fill="FFC7CE"/>
-          </w:tcPr>
-          <w:p>
-            <w:pPr>
-              <w:spacing w:before="20" w:after="20"/>
-              <w:jc w:val="center"/>
-            </w:pPr>
-            <w:r/>
-            <w:r>
-              <w:rPr>
-                <w:rFonts w:ascii="Calibri" w:hAnsi="Calibri"/>
-                <w:b/>
-                <w:color w:val="9C0006"/>
-                <w:sz w:val="15"/>
-              </w:rPr>
-              <w:t>Wajib ditempuh</w:t>
             </w:r>
           </w:p>
         </w:tc>

</xml_diff>

<commit_message>
feat: initialize 2026 OBE curriculum documentation, reporting tools, and migration audit files
</commit_message>
<xml_diff>
--- a/KURIKULUM2026_REVISI/024_RINGKAS_EKIVALENSI_UNTUK_AWAM.docx
+++ b/KURIKULUM2026_REVISI/024_RINGKAS_EKIVALENSI_UNTUK_AWAM.docx
@@ -3246,7 +3246,7 @@
                 <w:b w:val="0"/>
                 <w:sz w:val="16"/>
               </w:rPr>
-              <w:t>Dua MK mengampu BK yang sama (BK-IS13 / BK-IT09) dengan overlap ± 70%. Materi riset pengguna lanjutan dipindahkan ke elektif `STC-01` UX Research &amp; Design</w:t>
+              <w:t>Dua MK mengampu BK yang sama (BK-IS13 / BK-IT09) dengan overlap ± 70%. Materi riset pengguna lanjutan dipindahkan ke elektif `STC-501` UX Research &amp; Design</w:t>
             </w:r>
           </w:p>
         </w:tc>
@@ -3325,7 +3325,7 @@
                 <w:b w:val="0"/>
                 <w:sz w:val="16"/>
               </w:rPr>
-              <w:t>STC-04 Immersive Media &amp; XR Development</w:t>
+              <w:t>STC-701 Immersive Media &amp; XR Development</w:t>
             </w:r>
           </w:p>
         </w:tc>
@@ -7540,7 +7540,7 @@
                 <w:b w:val="0"/>
                 <w:sz w:val="15"/>
               </w:rPr>
-              <w:t>STC-04</w:t>
+              <w:t>STC-701</w:t>
             </w:r>
           </w:p>
         </w:tc>
@@ -7720,7 +7720,7 @@
                 <w:b w:val="0"/>
                 <w:sz w:val="15"/>
               </w:rPr>
-              <w:t>STA-02</w:t>
+              <w:t>STA-601</w:t>
             </w:r>
           </w:p>
         </w:tc>
@@ -10597,7 +10597,7 @@
                 <w:b w:val="0"/>
                 <w:sz w:val="15"/>
               </w:rPr>
-              <w:t>STB-01</w:t>
+              <w:t>STB-501</w:t>
             </w:r>
           </w:p>
         </w:tc>
@@ -10957,7 +10957,7 @@
                 <w:b w:val="0"/>
                 <w:sz w:val="15"/>
               </w:rPr>
-              <w:t>STC-04</w:t>
+              <w:t>STC-701</w:t>
             </w:r>
           </w:p>
         </w:tc>
@@ -11317,7 +11317,7 @@
                 <w:b w:val="0"/>
                 <w:sz w:val="15"/>
               </w:rPr>
-              <w:t>STA-01</w:t>
+              <w:t>STA-501</w:t>
             </w:r>
           </w:p>
         </w:tc>
@@ -13476,7 +13476,7 @@
                 <w:b w:val="0"/>
                 <w:sz w:val="15"/>
               </w:rPr>
-              <w:t>STB-04</w:t>
+              <w:t>STB-701</w:t>
             </w:r>
           </w:p>
         </w:tc>
@@ -18910,7 +18910,7 @@
                 <w:b w:val="0"/>
                 <w:sz w:val="15"/>
               </w:rPr>
-              <w:t>STA-01</w:t>
+              <w:t>STA-501</w:t>
             </w:r>
           </w:p>
         </w:tc>
@@ -19050,7 +19050,7 @@
                 <w:b w:val="0"/>
                 <w:sz w:val="15"/>
               </w:rPr>
-              <w:t>STB-01</w:t>
+              <w:t>STB-501</w:t>
             </w:r>
           </w:p>
         </w:tc>
@@ -19190,7 +19190,7 @@
                 <w:b w:val="0"/>
                 <w:sz w:val="15"/>
               </w:rPr>
-              <w:t>STC-01</w:t>
+              <w:t>STC-501</w:t>
             </w:r>
           </w:p>
         </w:tc>
@@ -20170,7 +20170,7 @@
                 <w:b w:val="0"/>
                 <w:sz w:val="15"/>
               </w:rPr>
-              <w:t>STA-02</w:t>
+              <w:t>STA-601</w:t>
             </w:r>
           </w:p>
         </w:tc>
@@ -20310,7 +20310,7 @@
                 <w:b w:val="0"/>
                 <w:sz w:val="15"/>
               </w:rPr>
-              <w:t>STA-03</w:t>
+              <w:t>STA-602</w:t>
             </w:r>
           </w:p>
         </w:tc>
@@ -20450,7 +20450,7 @@
                 <w:b w:val="0"/>
                 <w:sz w:val="15"/>
               </w:rPr>
-              <w:t>STB-02</w:t>
+              <w:t>STB-601</w:t>
             </w:r>
           </w:p>
         </w:tc>
@@ -20590,7 +20590,7 @@
                 <w:b w:val="0"/>
                 <w:sz w:val="15"/>
               </w:rPr>
-              <w:t>STB-03</w:t>
+              <w:t>STB-602</w:t>
             </w:r>
           </w:p>
         </w:tc>
@@ -20730,7 +20730,7 @@
                 <w:b w:val="0"/>
                 <w:sz w:val="15"/>
               </w:rPr>
-              <w:t>STC-02</w:t>
+              <w:t>STC-601</w:t>
             </w:r>
           </w:p>
         </w:tc>
@@ -20870,7 +20870,7 @@
                 <w:b w:val="0"/>
                 <w:sz w:val="15"/>
               </w:rPr>
-              <w:t>STC-03</w:t>
+              <w:t>STC-602</w:t>
             </w:r>
           </w:p>
         </w:tc>
@@ -21990,7 +21990,7 @@
                 <w:b w:val="0"/>
                 <w:sz w:val="15"/>
               </w:rPr>
-              <w:t>STA-04</w:t>
+              <w:t>STA-701</w:t>
             </w:r>
           </w:p>
         </w:tc>
@@ -22130,7 +22130,7 @@
                 <w:b w:val="0"/>
                 <w:sz w:val="15"/>
               </w:rPr>
-              <w:t>STA-05</w:t>
+              <w:t>STA-702</w:t>
             </w:r>
           </w:p>
         </w:tc>
@@ -22270,7 +22270,7 @@
                 <w:b w:val="0"/>
                 <w:sz w:val="15"/>
               </w:rPr>
-              <w:t>STA-06</w:t>
+              <w:t>STA-703</w:t>
             </w:r>
           </w:p>
         </w:tc>
@@ -22410,7 +22410,7 @@
                 <w:b w:val="0"/>
                 <w:sz w:val="15"/>
               </w:rPr>
-              <w:t>STB-04</w:t>
+              <w:t>STB-701</w:t>
             </w:r>
           </w:p>
         </w:tc>
@@ -22550,7 +22550,7 @@
                 <w:b w:val="0"/>
                 <w:sz w:val="15"/>
               </w:rPr>
-              <w:t>STB-05</w:t>
+              <w:t>STB-702</w:t>
             </w:r>
           </w:p>
         </w:tc>
@@ -22690,7 +22690,7 @@
                 <w:b w:val="0"/>
                 <w:sz w:val="15"/>
               </w:rPr>
-              <w:t>STB-06</w:t>
+              <w:t>STB-703</w:t>
             </w:r>
           </w:p>
         </w:tc>
@@ -22830,7 +22830,7 @@
                 <w:b w:val="0"/>
                 <w:sz w:val="15"/>
               </w:rPr>
-              <w:t>STC-04</w:t>
+              <w:t>STC-701</w:t>
             </w:r>
           </w:p>
         </w:tc>
@@ -22970,7 +22970,7 @@
                 <w:b w:val="0"/>
                 <w:sz w:val="15"/>
               </w:rPr>
-              <w:t>STC-05</w:t>
+              <w:t>STC-702</w:t>
             </w:r>
           </w:p>
         </w:tc>
@@ -23110,7 +23110,7 @@
                 <w:b w:val="0"/>
                 <w:sz w:val="15"/>
               </w:rPr>
-              <w:t>STC-06</w:t>
+              <w:t>STC-703</w:t>
             </w:r>
           </w:p>
         </w:tc>
@@ -23761,7 +23761,7 @@
                 <w:b w:val="0"/>
                 <w:sz w:val="15"/>
               </w:rPr>
-              <w:t>STA-01</w:t>
+              <w:t>STA-501</w:t>
             </w:r>
           </w:p>
         </w:tc>
@@ -23901,7 +23901,7 @@
                 <w:b w:val="0"/>
                 <w:sz w:val="15"/>
               </w:rPr>
-              <w:t>STA-02</w:t>
+              <w:t>STA-601</w:t>
             </w:r>
           </w:p>
         </w:tc>
@@ -24041,7 +24041,7 @@
                 <w:b w:val="0"/>
                 <w:sz w:val="15"/>
               </w:rPr>
-              <w:t>STA-03</w:t>
+              <w:t>STA-602</w:t>
             </w:r>
           </w:p>
         </w:tc>
@@ -24181,7 +24181,7 @@
                 <w:b w:val="0"/>
                 <w:sz w:val="15"/>
               </w:rPr>
-              <w:t>STA-04</w:t>
+              <w:t>STA-701</w:t>
             </w:r>
           </w:p>
         </w:tc>
@@ -24321,7 +24321,7 @@
                 <w:b w:val="0"/>
                 <w:sz w:val="15"/>
               </w:rPr>
-              <w:t>STA-05</w:t>
+              <w:t>STA-702</w:t>
             </w:r>
           </w:p>
         </w:tc>
@@ -24461,7 +24461,7 @@
                 <w:b w:val="0"/>
                 <w:sz w:val="15"/>
               </w:rPr>
-              <w:t>STA-06</w:t>
+              <w:t>STA-703</w:t>
             </w:r>
           </w:p>
         </w:tc>
@@ -24601,7 +24601,7 @@
                 <w:b w:val="0"/>
                 <w:sz w:val="15"/>
               </w:rPr>
-              <w:t>STB-01</w:t>
+              <w:t>STB-501</w:t>
             </w:r>
           </w:p>
         </w:tc>
@@ -24741,7 +24741,7 @@
                 <w:b w:val="0"/>
                 <w:sz w:val="15"/>
               </w:rPr>
-              <w:t>STB-02</w:t>
+              <w:t>STB-601</w:t>
             </w:r>
           </w:p>
         </w:tc>
@@ -24881,7 +24881,7 @@
                 <w:b w:val="0"/>
                 <w:sz w:val="15"/>
               </w:rPr>
-              <w:t>STB-03</w:t>
+              <w:t>STB-602</w:t>
             </w:r>
           </w:p>
         </w:tc>
@@ -25021,7 +25021,7 @@
                 <w:b w:val="0"/>
                 <w:sz w:val="15"/>
               </w:rPr>
-              <w:t>STB-04</w:t>
+              <w:t>STB-701</w:t>
             </w:r>
           </w:p>
         </w:tc>
@@ -25161,7 +25161,7 @@
                 <w:b w:val="0"/>
                 <w:sz w:val="15"/>
               </w:rPr>
-              <w:t>STB-05</w:t>
+              <w:t>STB-702</w:t>
             </w:r>
           </w:p>
         </w:tc>
@@ -25301,7 +25301,7 @@
                 <w:b w:val="0"/>
                 <w:sz w:val="15"/>
               </w:rPr>
-              <w:t>STB-06</w:t>
+              <w:t>STB-703</w:t>
             </w:r>
           </w:p>
         </w:tc>
@@ -25441,7 +25441,7 @@
                 <w:b w:val="0"/>
                 <w:sz w:val="15"/>
               </w:rPr>
-              <w:t>STC-01</w:t>
+              <w:t>STC-501</w:t>
             </w:r>
           </w:p>
         </w:tc>
@@ -25581,7 +25581,7 @@
                 <w:b w:val="0"/>
                 <w:sz w:val="15"/>
               </w:rPr>
-              <w:t>STC-02</w:t>
+              <w:t>STC-601</w:t>
             </w:r>
           </w:p>
         </w:tc>
@@ -25721,7 +25721,7 @@
                 <w:b w:val="0"/>
                 <w:sz w:val="15"/>
               </w:rPr>
-              <w:t>STC-03</w:t>
+              <w:t>STC-602</w:t>
             </w:r>
           </w:p>
         </w:tc>
@@ -25861,7 +25861,7 @@
                 <w:b w:val="0"/>
                 <w:sz w:val="15"/>
               </w:rPr>
-              <w:t>STC-04</w:t>
+              <w:t>STC-701</w:t>
             </w:r>
           </w:p>
         </w:tc>
@@ -26001,7 +26001,7 @@
                 <w:b w:val="0"/>
                 <w:sz w:val="15"/>
               </w:rPr>
-              <w:t>STC-05</w:t>
+              <w:t>STC-702</w:t>
             </w:r>
           </w:p>
         </w:tc>
@@ -26141,7 +26141,7 @@
                 <w:b w:val="0"/>
                 <w:sz w:val="15"/>
               </w:rPr>
-              <w:t>STC-06</w:t>
+              <w:t>STC-703</w:t>
             </w:r>
           </w:p>
         </w:tc>

</xml_diff>